<commit_message>
te veel gebieden in mijn regio
https://github.com/provinciesincijfers/PinC-taakopvolging/issues/512#issuecomment-3553097105
</commit_message>
<xml_diff>
--- a/09. Controle/Checklist controle.docx
+++ b/09. Controle/Checklist controle.docx
@@ -45,7 +45,21 @@
         <w:rPr>
           <w:b/>
         </w:rPr>
-        <w:t>, van metadatafiches, rapporten en het dashboard</w:t>
+        <w:t xml:space="preserve">, van </w:t>
+      </w:r>
+      <w:proofErr w:type="spellStart"/>
+      <w:r>
+        <w:rPr>
+          <w:b/>
+        </w:rPr>
+        <w:t>metadatafiches</w:t>
+      </w:r>
+      <w:proofErr w:type="spellEnd"/>
+      <w:r>
+        <w:rPr>
+          <w:b/>
+        </w:rPr>
+        <w:t>, rapporten en het dashboard</w:t>
       </w:r>
       <w:r>
         <w:rPr>
@@ -139,12 +153,14 @@
         </w:rPr>
         <w:t xml:space="preserve">afspraken bij het maken van </w:t>
       </w:r>
+      <w:proofErr w:type="spellStart"/>
       <w:r>
         <w:rPr>
           <w:b/>
         </w:rPr>
         <w:t>stories</w:t>
       </w:r>
+      <w:proofErr w:type="spellEnd"/>
       <w:r>
         <w:rPr>
           <w:bCs/>
@@ -250,11 +266,19 @@
           <w:bCs/>
         </w:rPr>
       </w:pPr>
+      <w:proofErr w:type="spellStart"/>
       <w:r>
         <w:rPr>
           <w:bCs/>
         </w:rPr>
-        <w:t>Steekproefgewijs controleren van reeds beschikbare cijfers</w:t>
+        <w:t>Steekproefgewijs</w:t>
+      </w:r>
+      <w:proofErr w:type="spellEnd"/>
+      <w:r>
+        <w:rPr>
+          <w:bCs/>
+        </w:rPr>
+        <w:t xml:space="preserve"> controleren van reeds beschikbare cijfers</w:t>
       </w:r>
     </w:p>
     <w:p>
@@ -335,7 +359,21 @@
         <w:rPr>
           <w:bCs/>
         </w:rPr>
-        <w:t>Af en toe kan het (steekproefgewijs) toch interessant zijn om een grondige controle uit te voeren.</w:t>
+        <w:t>Af en toe kan het (</w:t>
+      </w:r>
+      <w:proofErr w:type="spellStart"/>
+      <w:r>
+        <w:rPr>
+          <w:bCs/>
+        </w:rPr>
+        <w:t>steekproefgewijs</w:t>
+      </w:r>
+      <w:proofErr w:type="spellEnd"/>
+      <w:r>
+        <w:rPr>
+          <w:bCs/>
+        </w:rPr>
+        <w:t>) toch interessant zijn om een grondige controle uit te voeren.</w:t>
       </w:r>
     </w:p>
     <w:p>
@@ -353,7 +391,15 @@
         <w:t xml:space="preserve">werkte een python-script uit </w:t>
       </w:r>
       <w:r>
-        <w:t xml:space="preserve">dat checkt op outliers – </w:t>
+        <w:t xml:space="preserve">dat checkt op </w:t>
+      </w:r>
+      <w:proofErr w:type="spellStart"/>
+      <w:r>
+        <w:t>outliers</w:t>
+      </w:r>
+      <w:proofErr w:type="spellEnd"/>
+      <w:r>
+        <w:t xml:space="preserve"> – </w:t>
       </w:r>
       <w:r>
         <w:t xml:space="preserve">Dit kan helpen om te controleren of de cijfers juist zijn en evoluties plausibel zijn: </w:t>
@@ -421,7 +467,15 @@
         <w:ind w:left="714" w:hanging="357"/>
       </w:pPr>
       <w:r>
-        <w:t>Is voor alle onderwerpen een metadatafiche aanwezig?</w:t>
+        <w:t xml:space="preserve">Is voor alle onderwerpen een </w:t>
+      </w:r>
+      <w:proofErr w:type="spellStart"/>
+      <w:r>
+        <w:t>metadatafiche</w:t>
+      </w:r>
+      <w:proofErr w:type="spellEnd"/>
+      <w:r>
+        <w:t xml:space="preserve"> aanwezig?</w:t>
       </w:r>
     </w:p>
     <w:p>
@@ -483,7 +537,15 @@
         <w:ind w:left="714" w:hanging="357"/>
       </w:pPr>
       <w:r>
-        <w:t>Staan de percentages in een submap indien er meer dan 12 onderwerpen in totaal zijn?</w:t>
+        <w:t xml:space="preserve">Staan de percentages in een </w:t>
+      </w:r>
+      <w:proofErr w:type="spellStart"/>
+      <w:r>
+        <w:t>submap</w:t>
+      </w:r>
+      <w:proofErr w:type="spellEnd"/>
+      <w:r>
+        <w:t xml:space="preserve"> indien er meer dan 12 onderwerpen in totaal zijn?</w:t>
       </w:r>
       <w:r>
         <w:t xml:space="preserve"> </w:t>
@@ -499,7 +561,15 @@
         <w:ind w:left="714" w:hanging="357"/>
       </w:pPr>
       <w:r>
-        <w:t xml:space="preserve">Naam van de submap is </w:t>
+        <w:t xml:space="preserve">Naam van de </w:t>
+      </w:r>
+      <w:proofErr w:type="spellStart"/>
+      <w:r>
+        <w:t>submap</w:t>
+      </w:r>
+      <w:proofErr w:type="spellEnd"/>
+      <w:r>
+        <w:t xml:space="preserve"> is </w:t>
       </w:r>
       <w:r>
         <w:t>“</w:t>
@@ -578,7 +648,15 @@
         <w:ind w:left="714" w:hanging="357"/>
       </w:pPr>
       <w:r>
-        <w:t xml:space="preserve">Als de data op statsec beschikbaar is, staat het ook in de map GEBIEDSINDELINGEN &gt; </w:t>
+        <w:t xml:space="preserve">Als de data op </w:t>
+      </w:r>
+      <w:proofErr w:type="spellStart"/>
+      <w:r>
+        <w:t>statsec</w:t>
+      </w:r>
+      <w:proofErr w:type="spellEnd"/>
+      <w:r>
+        <w:t xml:space="preserve"> beschikbaar is, staat het ook in de map GEBIEDSINDELINGEN &gt; </w:t>
       </w:r>
       <w:r>
         <w:t>Beschikbaar vanaf statistische sector</w:t>
@@ -597,7 +675,15 @@
         <w:ind w:left="714" w:hanging="357"/>
       </w:pPr>
       <w:r>
-        <w:t>Is de data op statsec ook beschikbaar zonder inloggen?</w:t>
+        <w:t xml:space="preserve">Is de data op </w:t>
+      </w:r>
+      <w:proofErr w:type="spellStart"/>
+      <w:r>
+        <w:t>statsec</w:t>
+      </w:r>
+      <w:proofErr w:type="spellEnd"/>
+      <w:r>
+        <w:t xml:space="preserve"> ook beschikbaar zonder inloggen?</w:t>
       </w:r>
     </w:p>
     <w:p>
@@ -634,12 +720,14 @@
         <w:t xml:space="preserve">Zie informatie over de belangrijkste velden op </w:t>
       </w:r>
       <w:hyperlink r:id="rId15" w:history="1">
+        <w:proofErr w:type="spellStart"/>
         <w:r>
           <w:rPr>
             <w:rStyle w:val="Hyperlink"/>
           </w:rPr>
           <w:t>Github</w:t>
         </w:r>
+        <w:proofErr w:type="spellEnd"/>
       </w:hyperlink>
       <w:r>
         <w:rPr>
@@ -660,13 +748,37 @@
         <w:t xml:space="preserve">Zichtbaarheid van mapnamen in presentaties: </w:t>
       </w:r>
       <w:r>
-        <w:t xml:space="preserve">“Visible in title” </w:t>
+        <w:t>“</w:t>
+      </w:r>
+      <w:proofErr w:type="spellStart"/>
+      <w:r>
+        <w:t>Visible</w:t>
+      </w:r>
+      <w:proofErr w:type="spellEnd"/>
+      <w:r>
+        <w:t xml:space="preserve"> in </w:t>
+      </w:r>
+      <w:proofErr w:type="spellStart"/>
+      <w:r>
+        <w:t>title</w:t>
+      </w:r>
+      <w:proofErr w:type="spellEnd"/>
+      <w:r>
+        <w:t xml:space="preserve">” </w:t>
       </w:r>
       <w:r>
         <w:t>uitvinken indien nodig</w:t>
       </w:r>
       <w:r>
-        <w:t xml:space="preserve"> (menu Edit achter rechtermuisklik op map)</w:t>
+        <w:t xml:space="preserve"> (menu </w:t>
+      </w:r>
+      <w:proofErr w:type="spellStart"/>
+      <w:r>
+        <w:t>Edit</w:t>
+      </w:r>
+      <w:proofErr w:type="spellEnd"/>
+      <w:r>
+        <w:t xml:space="preserve"> achter rechtermuisklik op map)</w:t>
       </w:r>
       <w:r>
         <w:rPr>
@@ -904,8 +1016,9 @@
           <w:szCs w:val="21"/>
           <w:lang w:eastAsia="nl-BE"/>
         </w:rPr>
-        <w:t>Woord gemiddelde enkel gebruiken in onderwerpnaam indien nodig voor leesbaarheid (vb "gemiddelde temperatuur" wél, maar gewoon "E-peil appartementen"</w:t>
-      </w:r>
+        <w:t>Woord gemiddelde enkel gebruiken in onderwerpnaam indien nodig voor leesbaarheid (</w:t>
+      </w:r>
+      <w:proofErr w:type="spellStart"/>
       <w:r>
         <w:rPr>
           <w:rFonts w:ascii="Segoe UI" w:eastAsia="Times New Roman" w:hAnsi="Segoe UI" w:cs="Segoe UI"/>
@@ -914,6 +1027,27 @@
           <w:szCs w:val="21"/>
           <w:lang w:eastAsia="nl-BE"/>
         </w:rPr>
+        <w:t>vb</w:t>
+      </w:r>
+      <w:proofErr w:type="spellEnd"/>
+      <w:r>
+        <w:rPr>
+          <w:rFonts w:ascii="Segoe UI" w:eastAsia="Times New Roman" w:hAnsi="Segoe UI" w:cs="Segoe UI"/>
+          <w:color w:val="24292E"/>
+          <w:sz w:val="21"/>
+          <w:szCs w:val="21"/>
+          <w:lang w:eastAsia="nl-BE"/>
+        </w:rPr>
+        <w:t xml:space="preserve"> "gemiddelde temperatuur" wél, maar gewoon "E-peil appartementen"</w:t>
+      </w:r>
+      <w:r>
+        <w:rPr>
+          <w:rFonts w:ascii="Segoe UI" w:eastAsia="Times New Roman" w:hAnsi="Segoe UI" w:cs="Segoe UI"/>
+          <w:color w:val="24292E"/>
+          <w:sz w:val="21"/>
+          <w:szCs w:val="21"/>
+          <w:lang w:eastAsia="nl-BE"/>
+        </w:rPr>
         <w:t>.</w:t>
       </w:r>
     </w:p>
@@ -932,7 +1066,21 @@
         <w:rPr>
           <w:rFonts w:eastAsiaTheme="minorEastAsia"/>
         </w:rPr>
-        <w:t xml:space="preserve">Percentage worden omgeschreven met (t.o.v. x), promilles met per </w:t>
+        <w:t xml:space="preserve">Percentage worden omgeschreven met (t.o.v. x), </w:t>
+      </w:r>
+      <w:proofErr w:type="spellStart"/>
+      <w:r>
+        <w:rPr>
+          <w:rFonts w:eastAsiaTheme="minorEastAsia"/>
+        </w:rPr>
+        <w:t>promilles</w:t>
+      </w:r>
+      <w:proofErr w:type="spellEnd"/>
+      <w:r>
+        <w:rPr>
+          <w:rFonts w:eastAsiaTheme="minorEastAsia"/>
+        </w:rPr>
+        <w:t xml:space="preserve"> met per </w:t>
       </w:r>
       <w:r>
         <w:rPr>
@@ -1080,7 +1228,23 @@
         <w:spacing w:after="120" w:line="240" w:lineRule="auto"/>
       </w:pPr>
       <w:r>
-        <w:t>Kortere versies zijn toegestaan in naam onderwerp in databank, o.w.v. beperkt aantal tekens (in dashboard wordt alles voluit geschreven o.w.v. de leesbaarheid)</w:t>
+        <w:t xml:space="preserve">Kortere versies zijn toegestaan in naam onderwerp in databank, </w:t>
+      </w:r>
+      <w:proofErr w:type="spellStart"/>
+      <w:r>
+        <w:t>o.w.v</w:t>
+      </w:r>
+      <w:proofErr w:type="spellEnd"/>
+      <w:r>
+        <w:t xml:space="preserve">. beperkt aantal tekens (in dashboard wordt alles voluit geschreven </w:t>
+      </w:r>
+      <w:proofErr w:type="spellStart"/>
+      <w:r>
+        <w:t>o.w.v</w:t>
+      </w:r>
+      <w:proofErr w:type="spellEnd"/>
+      <w:r>
+        <w:t>. de leesbaarheid)</w:t>
       </w:r>
       <w:r>
         <w:t>.</w:t>
@@ -1107,12 +1271,14 @@
         <w:t xml:space="preserve">Zie informatie over de belangrijkste velden op </w:t>
       </w:r>
       <w:hyperlink r:id="rId19" w:history="1">
+        <w:proofErr w:type="spellStart"/>
         <w:r>
           <w:rPr>
             <w:rStyle w:val="Hyperlink"/>
           </w:rPr>
           <w:t>Github</w:t>
         </w:r>
+        <w:proofErr w:type="spellEnd"/>
       </w:hyperlink>
       <w:r>
         <w:rPr>
@@ -1296,7 +1462,23 @@
         <w:t>Zijn de cijfers juist?</w:t>
       </w:r>
       <w:r>
-        <w:t xml:space="preserve"> Vergelijk de nieuwe jaargang met vorige jaargangen – zijn de evoluties plausibel? Doe dit zeker ook op subgemeentelijk niveau indien van toepassing. Indien meerdere jaren vernieuwd worden: vergelijk de cijfers in de admin/jive met de reeds gepubliceerde cijfers. Vergelijk de ingelezen cijfers met de ruwe data of eventuele elders gepubliceerde cijfers. </w:t>
+        <w:t xml:space="preserve"> Vergelijk de nieuwe jaargang met vorige jaargangen – zijn de evoluties plausibel? Doe dit zeker ook op </w:t>
+      </w:r>
+      <w:proofErr w:type="spellStart"/>
+      <w:r>
+        <w:t>subgemeentelijk</w:t>
+      </w:r>
+      <w:proofErr w:type="spellEnd"/>
+      <w:r>
+        <w:t xml:space="preserve"> niveau indien van toepassing. Indien meerdere jaren vernieuwd worden: vergelijk de cijfers in de </w:t>
+      </w:r>
+      <w:proofErr w:type="spellStart"/>
+      <w:r>
+        <w:t>admin</w:t>
+      </w:r>
+      <w:proofErr w:type="spellEnd"/>
+      <w:r>
+        <w:t xml:space="preserve">/jive met de reeds gepubliceerde cijfers. Vergelijk de ingelezen cijfers met de ruwe data of eventuele elders gepubliceerde cijfers. </w:t>
       </w:r>
       <w:r>
         <w:t>Controleer de waarden van door jou gekende regio of gemeenten. Lijken de resultaten geloofwaardig?</w:t>
@@ -1332,8 +1514,16 @@
           <w:rPr>
             <w:rStyle w:val="Hyperlink"/>
           </w:rPr>
-          <w:t>Missing values</w:t>
+          <w:t xml:space="preserve">Missing </w:t>
         </w:r>
+        <w:proofErr w:type="spellStart"/>
+        <w:r>
+          <w:rPr>
+            <w:rStyle w:val="Hyperlink"/>
+          </w:rPr>
+          <w:t>values</w:t>
+        </w:r>
+        <w:proofErr w:type="spellEnd"/>
       </w:hyperlink>
       <w:r>
         <w:rPr>
@@ -1384,7 +1574,15 @@
         <w:t>Consequent gebruik van eenheid (en combinatie met datatype), bijvoorbeeld bij oppervlakte</w:t>
       </w:r>
       <w:r>
-        <w:t>. Gebruik Mean / Ratio</w:t>
+        <w:t xml:space="preserve">. Gebruik </w:t>
+      </w:r>
+      <w:proofErr w:type="spellStart"/>
+      <w:r>
+        <w:t>Mean</w:t>
+      </w:r>
+      <w:proofErr w:type="spellEnd"/>
+      <w:r>
+        <w:t xml:space="preserve"> / Ratio</w:t>
       </w:r>
       <w:r>
         <w:t>.</w:t>
@@ -1454,7 +1652,15 @@
         <w:spacing w:after="120" w:line="240" w:lineRule="auto"/>
       </w:pPr>
       <w:r>
-        <w:t xml:space="preserve">Is niet-aggregeerbare data effectief onbeschikbaar op hogere gebiedsniveaus (staat de aggregatie uit)? </w:t>
+        <w:t xml:space="preserve">Is niet-aggregeerbare data effectief </w:t>
+      </w:r>
+      <w:proofErr w:type="spellStart"/>
+      <w:r>
+        <w:t>onbeschikbaar</w:t>
+      </w:r>
+      <w:proofErr w:type="spellEnd"/>
+      <w:r>
+        <w:t xml:space="preserve"> op hogere gebiedsniveaus (staat de aggregatie uit)? </w:t>
       </w:r>
     </w:p>
     <w:p>
@@ -1490,19 +1696,43 @@
         <w:spacing w:after="120" w:line="240" w:lineRule="auto"/>
       </w:pPr>
       <w:r>
-        <w:t>Voor data op statsec-niveau: werden de data op het nieuwe gebiedsniveau ingeladen?</w:t>
-      </w:r>
-    </w:p>
-    <w:p>
-      <w:pPr>
-        <w:numPr>
-          <w:ilvl w:val="0"/>
-          <w:numId w:val="1"/>
-        </w:numPr>
-        <w:spacing w:after="120" w:line="240" w:lineRule="auto"/>
-      </w:pPr>
-      <w:r>
-        <w:t>Als de data subgemeentelijk beschikbaar is: zijn ze ZONDER INLOGGEN beschikbaar? Check ook subgemeentelijk wat je op gemeentelijk niveau zou doen.</w:t>
+        <w:t xml:space="preserve">Voor data op </w:t>
+      </w:r>
+      <w:proofErr w:type="spellStart"/>
+      <w:r>
+        <w:t>statsec</w:t>
+      </w:r>
+      <w:proofErr w:type="spellEnd"/>
+      <w:r>
+        <w:t>-niveau: werden de data op het nieuwe gebiedsniveau ingeladen?</w:t>
+      </w:r>
+    </w:p>
+    <w:p>
+      <w:pPr>
+        <w:numPr>
+          <w:ilvl w:val="0"/>
+          <w:numId w:val="1"/>
+        </w:numPr>
+        <w:spacing w:after="120" w:line="240" w:lineRule="auto"/>
+      </w:pPr>
+      <w:r>
+        <w:t xml:space="preserve">Als de data </w:t>
+      </w:r>
+      <w:proofErr w:type="spellStart"/>
+      <w:r>
+        <w:t>subgemeentelijk</w:t>
+      </w:r>
+      <w:proofErr w:type="spellEnd"/>
+      <w:r>
+        <w:t xml:space="preserve"> beschikbaar is: zijn ze ZONDER INLOGGEN beschikbaar? Check ook </w:t>
+      </w:r>
+      <w:proofErr w:type="spellStart"/>
+      <w:r>
+        <w:t>subgemeentelijk</w:t>
+      </w:r>
+      <w:proofErr w:type="spellEnd"/>
+      <w:r>
+        <w:t xml:space="preserve"> wat je op gemeentelijk niveau zou doen.</w:t>
       </w:r>
     </w:p>
     <w:p>
@@ -1632,7 +1862,15 @@
         <w:spacing w:after="120" w:line="240" w:lineRule="auto"/>
       </w:pPr>
       <w:r>
-        <w:t>Kloppen de dimensies bij de kubussen (bv. geen dubbels)?</w:t>
+        <w:t xml:space="preserve">Kloppen de dimensies bij de kubussen (bv. geen </w:t>
+      </w:r>
+      <w:proofErr w:type="spellStart"/>
+      <w:r>
+        <w:t>dubbels</w:t>
+      </w:r>
+      <w:proofErr w:type="spellEnd"/>
+      <w:r>
+        <w:t>)?</w:t>
       </w:r>
       <w:r>
         <w:t xml:space="preserve"> Zijn de dimensies ook zichtbaar zonder inloggen?</w:t>
@@ -1676,12 +1914,14 @@
           <w:lang w:val="en-GB"/>
         </w:rPr>
       </w:pPr>
+      <w:proofErr w:type="spellStart"/>
       <w:r>
         <w:rPr>
           <w:lang w:val="en-GB"/>
         </w:rPr>
         <w:t>Metadatafiches</w:t>
       </w:r>
+      <w:proofErr w:type="spellEnd"/>
     </w:p>
     <w:p>
       <w:pPr>
@@ -1689,18 +1929,76 @@
           <w:lang w:val="en-GB"/>
         </w:rPr>
       </w:pPr>
+      <w:proofErr w:type="spellStart"/>
       <w:r>
         <w:rPr>
           <w:lang w:val="en-GB"/>
         </w:rPr>
-        <w:t>Zie Teams: Uploadfiles PinC &gt; 00 M</w:t>
-      </w:r>
+        <w:t>Zie</w:t>
+      </w:r>
+      <w:proofErr w:type="spellEnd"/>
       <w:r>
         <w:rPr>
           <w:lang w:val="en-GB"/>
         </w:rPr>
-        <w:t>etadatafiches PinC</w:t>
-      </w:r>
+        <w:t xml:space="preserve"> Teams: </w:t>
+      </w:r>
+      <w:proofErr w:type="spellStart"/>
+      <w:r>
+        <w:rPr>
+          <w:lang w:val="en-GB"/>
+        </w:rPr>
+        <w:t>Uploadfiles</w:t>
+      </w:r>
+      <w:proofErr w:type="spellEnd"/>
+      <w:r>
+        <w:rPr>
+          <w:lang w:val="en-GB"/>
+        </w:rPr>
+        <w:t xml:space="preserve"> </w:t>
+      </w:r>
+      <w:proofErr w:type="spellStart"/>
+      <w:r>
+        <w:rPr>
+          <w:lang w:val="en-GB"/>
+        </w:rPr>
+        <w:t>PinC</w:t>
+      </w:r>
+      <w:proofErr w:type="spellEnd"/>
+      <w:r>
+        <w:rPr>
+          <w:lang w:val="en-GB"/>
+        </w:rPr>
+        <w:t xml:space="preserve"> &gt; 00 </w:t>
+      </w:r>
+      <w:proofErr w:type="spellStart"/>
+      <w:r>
+        <w:rPr>
+          <w:lang w:val="en-GB"/>
+        </w:rPr>
+        <w:t>M</w:t>
+      </w:r>
+      <w:r>
+        <w:rPr>
+          <w:lang w:val="en-GB"/>
+        </w:rPr>
+        <w:t>etadatafiches</w:t>
+      </w:r>
+      <w:proofErr w:type="spellEnd"/>
+      <w:r>
+        <w:rPr>
+          <w:lang w:val="en-GB"/>
+        </w:rPr>
+        <w:t xml:space="preserve"> </w:t>
+      </w:r>
+      <w:proofErr w:type="spellStart"/>
+      <w:r>
+        <w:rPr>
+          <w:lang w:val="en-GB"/>
+        </w:rPr>
+        <w:t>PinC</w:t>
+      </w:r>
+      <w:proofErr w:type="spellEnd"/>
     </w:p>
     <w:p>
       <w:pPr>
@@ -1826,7 +2124,15 @@
         <w:spacing w:after="120" w:line="240" w:lineRule="auto"/>
       </w:pPr>
       <w:r>
-        <w:t>Wordt bij dataleverancier voldoende gedetailleerd vermeld wat de bron van de data is? (bv. niet enkel ‘Statbel’, maar ook ‘landbouwtelling’)</w:t>
+        <w:t>Wordt bij dataleverancier voldoende gedetailleerd vermeld wat de bron van de data is? (bv. niet enkel ‘</w:t>
+      </w:r>
+      <w:proofErr w:type="spellStart"/>
+      <w:r>
+        <w:t>Statbel</w:t>
+      </w:r>
+      <w:proofErr w:type="spellEnd"/>
+      <w:r>
+        <w:t>’, maar ook ‘landbouwtelling’)</w:t>
       </w:r>
     </w:p>
     <w:p>
@@ -1954,7 +2260,15 @@
         </w:numPr>
       </w:pPr>
       <w:r>
-        <w:t>Zijn alle relevante indicatoren opgenomen? Bekijk dit ook zeker wanneer je een rapport uit de oude rapportenmodule omzet naar stories.</w:t>
+        <w:t xml:space="preserve">Zijn alle relevante indicatoren opgenomen? Bekijk dit ook zeker wanneer je een rapport uit de oude rapportenmodule omzet naar </w:t>
+      </w:r>
+      <w:proofErr w:type="spellStart"/>
+      <w:r>
+        <w:t>stories</w:t>
+      </w:r>
+      <w:proofErr w:type="spellEnd"/>
+      <w:r>
+        <w:t>.</w:t>
       </w:r>
     </w:p>
     <w:p>
@@ -2033,6 +2347,18 @@
         </w:numPr>
       </w:pPr>
       <w:r>
+        <w:t xml:space="preserve">Ga na tot hoeveel gebieden in Mijn regio het rapport nog behoorlijk werkt. Laat eventueel het rapport vervallen bij meer dan x gebieden in Mijn regio. </w:t>
+      </w:r>
+    </w:p>
+    <w:p>
+      <w:pPr>
+        <w:pStyle w:val="Lijstalinea"/>
+        <w:numPr>
+          <w:ilvl w:val="0"/>
+          <w:numId w:val="8"/>
+        </w:numPr>
+      </w:pPr>
+      <w:r>
         <w:t>Vergelijk de cijfers met deze in de databank en ga na of deze overeenkomen.</w:t>
       </w:r>
     </w:p>
@@ -2069,7 +2395,15 @@
         </w:numPr>
       </w:pPr>
       <w:r>
-        <w:t>Werken alle (externe) links? Controleer zeker de links naar bestaande rapporten, mogelijks werd er in de tussentijd een rapport omgezet naar stories.</w:t>
+        <w:t xml:space="preserve">Werken alle (externe) links? Controleer zeker de links naar bestaande rapporten, mogelijks werd er in de tussentijd een rapport omgezet naar </w:t>
+      </w:r>
+      <w:proofErr w:type="spellStart"/>
+      <w:r>
+        <w:t>stories</w:t>
+      </w:r>
+      <w:proofErr w:type="spellEnd"/>
+      <w:r>
+        <w:t>.</w:t>
       </w:r>
     </w:p>
     <w:p>
@@ -2117,7 +2451,15 @@
         </w:numPr>
       </w:pPr>
       <w:r>
-        <w:t xml:space="preserve">Controleer het rapport als je niet ingelogd bent (pas dan in de URL ‘admin/jive’ aan naar ‘databank’). Let wel: je hebt dan waarschijnlijk niet de laatste versie van het rapport maar de versie vlak na publicatie op vrijdagavond. </w:t>
+        <w:t>Controleer het rapport als je niet ingelogd bent (pas dan in de URL ‘</w:t>
+      </w:r>
+      <w:proofErr w:type="spellStart"/>
+      <w:r>
+        <w:t>admin</w:t>
+      </w:r>
+      <w:proofErr w:type="spellEnd"/>
+      <w:r>
+        <w:t xml:space="preserve">/jive’ aan naar ‘databank’). Let wel: je hebt dan waarschijnlijk niet de laatste versie van het rapport maar de versie vlak na publicatie op vrijdagavond. </w:t>
       </w:r>
     </w:p>
     <w:p>
@@ -2298,7 +2640,15 @@
         <w:ind w:left="714" w:hanging="357"/>
       </w:pPr>
       <w:r>
-        <w:t xml:space="preserve"> Zijn de contactgegevens up to date? </w:t>
+        <w:t xml:space="preserve"> Zijn de contactgegevens up </w:t>
+      </w:r>
+      <w:proofErr w:type="spellStart"/>
+      <w:r>
+        <w:t>to</w:t>
+      </w:r>
+      <w:proofErr w:type="spellEnd"/>
+      <w:r>
+        <w:t xml:space="preserve"> date? </w:t>
       </w:r>
     </w:p>
     <w:p>
@@ -2447,14 +2797,35 @@
         <w:footnoteRef/>
       </w:r>
       <w:r>
-        <w:t xml:space="preserve"> Hiermee wordt NIET verwezen naar het vakje ‘visible’ in de indicatorenlijst van studio maar naar die van het thema in de CategoryTree</w:t>
-      </w:r>
+        <w:t xml:space="preserve"> Hiermee wordt NIET verwezen naar het vakje ‘</w:t>
+      </w:r>
+      <w:proofErr w:type="spellStart"/>
+      <w:r>
+        <w:t>visible</w:t>
+      </w:r>
+      <w:proofErr w:type="spellEnd"/>
+      <w:r>
+        <w:t xml:space="preserve">’ in de indicatorenlijst van studio maar naar die van het thema in de </w:t>
+      </w:r>
+      <w:proofErr w:type="spellStart"/>
+      <w:r>
+        <w:t>CategoryTree</w:t>
+      </w:r>
+      <w:proofErr w:type="spellEnd"/>
       <w:r>
         <w:br/>
       </w:r>
       <w:r>
         <w:br/>
-        <w:t>Uitleg: wanneer in themaboom twee indicatoren geselecteerd worden, krijgt presentatie de titel van de eerst bovenliggende gezamenlijke map. Wanneer dit niet nodig is, moet dit uitgevinkt worden (bv. Bij nietszeggende mapnaam als ‘aantal’ of ‘thema’.)</w:t>
+        <w:t xml:space="preserve">Uitleg: wanneer in themaboom twee indicatoren geselecteerd worden, krijgt presentatie de titel van de eerst bovenliggende gezamenlijke map. Wanneer dit niet nodig is, moet dit </w:t>
+      </w:r>
+      <w:proofErr w:type="spellStart"/>
+      <w:r>
+        <w:t>uitgevinkt</w:t>
+      </w:r>
+      <w:proofErr w:type="spellEnd"/>
+      <w:r>
+        <w:t xml:space="preserve"> worden (bv. Bij nietszeggende mapnaam als ‘aantal’ of ‘thema’.)</w:t>
       </w:r>
     </w:p>
     <w:p>
@@ -4606,10 +4977,6 @@
 </file>
 
 <file path=customXml/item1.xml><?xml version="1.0" encoding="utf-8"?>
-<b:Sources xmlns:b="http://schemas.openxmlformats.org/officeDocument/2006/bibliography" xmlns="http://schemas.openxmlformats.org/officeDocument/2006/bibliography" SelectedStyle="\APASixthEditionOfficeOnline.xsl" StyleName="APA" Version="6"/>
-</file>
-
-<file path=customXml/item2.xml><?xml version="1.0" encoding="utf-8"?>
 <?mso-contentType ?>
 <FormTemplates xmlns="http://schemas.microsoft.com/sharepoint/v3/contenttype/forms">
   <Display>DocumentLibraryForm</Display>
@@ -4618,7 +4985,23 @@
 </FormTemplates>
 </file>
 
+<file path=customXml/item2.xml><?xml version="1.0" encoding="utf-8"?>
+<b:Sources xmlns:b="http://schemas.openxmlformats.org/officeDocument/2006/bibliography" xmlns="http://schemas.openxmlformats.org/officeDocument/2006/bibliography" SelectedStyle="\APASixthEditionOfficeOnline.xsl" StyleName="APA" Version="6"/>
+</file>
+
 <file path=customXml/item3.xml><?xml version="1.0" encoding="utf-8"?>
+<p:properties xmlns:p="http://schemas.microsoft.com/office/2006/metadata/properties" xmlns:xsi="http://www.w3.org/2001/XMLSchema-instance" xmlns:pc="http://schemas.microsoft.com/office/infopath/2007/PartnerControls">
+  <documentManagement>
+    <TaxCatchAll xmlns="3fe4ce35-33a6-4549-ad9a-d681415f09bc" xsi:nil="true"/>
+    <lcf76f155ced4ddcb4097134ff3c332f xmlns="50990e7d-986b-48ed-b7c7-e36476cb9bc9">
+      <Terms xmlns="http://schemas.microsoft.com/office/infopath/2007/PartnerControls"/>
+    </lcf76f155ced4ddcb4097134ff3c332f>
+    <SPFxTotalFileSize xmlns="3fe4ce35-33a6-4549-ad9a-d681415f09bc" xsi:nil="true"/>
+  </documentManagement>
+</p:properties>
+</file>
+
+<file path=customXml/item4.xml><?xml version="1.0" encoding="utf-8"?>
 <ct:contentTypeSchema xmlns:ct="http://schemas.microsoft.com/office/2006/metadata/contentType" xmlns:ma="http://schemas.microsoft.com/office/2006/metadata/properties/metaAttributes" ct:_="" ma:_="" ma:contentTypeName="Document" ma:contentTypeID="0x010100936F8FED91617845B8AEE40909B55B39" ma:contentTypeVersion="22" ma:contentTypeDescription="Een nieuw document maken." ma:contentTypeScope="" ma:versionID="408dc1e28d2a63c1dc5e68fe19e3fd51">
   <xsd:schema xmlns:xsd="http://www.w3.org/2001/XMLSchema" xmlns:xs="http://www.w3.org/2001/XMLSchema" xmlns:p="http://schemas.microsoft.com/office/2006/metadata/properties" xmlns:ns2="50990e7d-986b-48ed-b7c7-e36476cb9bc9" xmlns:ns3="3fe4ce35-33a6-4549-ad9a-d681415f09bc" targetNamespace="http://schemas.microsoft.com/office/2006/metadata/properties" ma:root="true" ma:fieldsID="4f2d0f3eb3fad191bdf2275537b96c6f" ns2:_="" ns3:_="">
     <xsd:import namespace="50990e7d-986b-48ed-b7c7-e36476cb9bc9"/>
@@ -4887,19 +5270,15 @@
 </ct:contentTypeSchema>
 </file>
 
-<file path=customXml/item4.xml><?xml version="1.0" encoding="utf-8"?>
-<p:properties xmlns:p="http://schemas.microsoft.com/office/2006/metadata/properties" xmlns:xsi="http://www.w3.org/2001/XMLSchema-instance" xmlns:pc="http://schemas.microsoft.com/office/infopath/2007/PartnerControls">
-  <documentManagement>
-    <TaxCatchAll xmlns="3fe4ce35-33a6-4549-ad9a-d681415f09bc" xsi:nil="true"/>
-    <lcf76f155ced4ddcb4097134ff3c332f xmlns="50990e7d-986b-48ed-b7c7-e36476cb9bc9">
-      <Terms xmlns="http://schemas.microsoft.com/office/infopath/2007/PartnerControls"/>
-    </lcf76f155ced4ddcb4097134ff3c332f>
-    <SPFxTotalFileSize xmlns="3fe4ce35-33a6-4549-ad9a-d681415f09bc" xsi:nil="true"/>
-  </documentManagement>
-</p:properties>
+<file path=customXml/itemProps1.xml><?xml version="1.0" encoding="utf-8"?>
+<ds:datastoreItem xmlns:ds="http://schemas.openxmlformats.org/officeDocument/2006/customXml" ds:itemID="{F5D094D8-AC9D-416B-BED9-257323B2C80F}">
+  <ds:schemaRefs>
+    <ds:schemaRef ds:uri="http://schemas.microsoft.com/sharepoint/v3/contenttype/forms"/>
+  </ds:schemaRefs>
+</ds:datastoreItem>
 </file>
 
-<file path=customXml/itemProps1.xml><?xml version="1.0" encoding="utf-8"?>
+<file path=customXml/itemProps2.xml><?xml version="1.0" encoding="utf-8"?>
 <ds:datastoreItem xmlns:ds="http://schemas.openxmlformats.org/officeDocument/2006/customXml" ds:itemID="{B009148A-7493-4967-9363-D05D79894680}">
   <ds:schemaRefs>
     <ds:schemaRef ds:uri="http://schemas.openxmlformats.org/officeDocument/2006/bibliography"/>
@@ -4907,15 +5286,18 @@
 </ds:datastoreItem>
 </file>
 
-<file path=customXml/itemProps2.xml><?xml version="1.0" encoding="utf-8"?>
-<ds:datastoreItem xmlns:ds="http://schemas.openxmlformats.org/officeDocument/2006/customXml" ds:itemID="{F5D094D8-AC9D-416B-BED9-257323B2C80F}">
+<file path=customXml/itemProps3.xml><?xml version="1.0" encoding="utf-8"?>
+<ds:datastoreItem xmlns:ds="http://schemas.openxmlformats.org/officeDocument/2006/customXml" ds:itemID="{B06C5F85-37CE-4228-A896-654359A5B98C}">
   <ds:schemaRefs>
-    <ds:schemaRef ds:uri="http://schemas.microsoft.com/sharepoint/v3/contenttype/forms"/>
+    <ds:schemaRef ds:uri="http://schemas.microsoft.com/office/2006/metadata/properties"/>
+    <ds:schemaRef ds:uri="http://schemas.microsoft.com/office/infopath/2007/PartnerControls"/>
+    <ds:schemaRef ds:uri="3fe4ce35-33a6-4549-ad9a-d681415f09bc"/>
+    <ds:schemaRef ds:uri="50990e7d-986b-48ed-b7c7-e36476cb9bc9"/>
   </ds:schemaRefs>
 </ds:datastoreItem>
 </file>
 
-<file path=customXml/itemProps3.xml><?xml version="1.0" encoding="utf-8"?>
+<file path=customXml/itemProps4.xml><?xml version="1.0" encoding="utf-8"?>
 <ds:datastoreItem xmlns:ds="http://schemas.openxmlformats.org/officeDocument/2006/customXml" ds:itemID="{557243C2-C9FB-4972-88C0-3C34DEA41B90}">
   <ds:schemaRefs>
     <ds:schemaRef ds:uri="http://schemas.microsoft.com/office/2006/metadata/contentType"/>
@@ -4932,15 +5314,4 @@
     <ds:schemaRef ds:uri="http://schemas.microsoft.com/internal/obd"/>
   </ds:schemaRefs>
 </ds:datastoreItem>
-</file>
-
-<file path=customXml/itemProps4.xml><?xml version="1.0" encoding="utf-8"?>
-<ds:datastoreItem xmlns:ds="http://schemas.openxmlformats.org/officeDocument/2006/customXml" ds:itemID="{B06C5F85-37CE-4228-A896-654359A5B98C}">
-  <ds:schemaRefs>
-    <ds:schemaRef ds:uri="http://schemas.microsoft.com/office/2006/metadata/properties"/>
-    <ds:schemaRef ds:uri="http://schemas.microsoft.com/office/infopath/2007/PartnerControls"/>
-    <ds:schemaRef ds:uri="3fe4ce35-33a6-4549-ad9a-d681415f09bc"/>
-    <ds:schemaRef ds:uri="50990e7d-986b-48ed-b7c7-e36476cb9bc9"/>
-  </ds:schemaRefs>
-</ds:datastoreItem>
 </file>
</xml_diff>

<commit_message>
update script geert met check dode links stories
closes https://github.com/provinciesincijfers/PinC-taakopvolging/issues/512
</commit_message>
<xml_diff>
--- a/09. Controle/Checklist controle.docx
+++ b/09. Controle/Checklist controle.docx
@@ -2405,6 +2405,39 @@
       <w:r>
         <w:t>.</w:t>
       </w:r>
+      <w:r>
+        <w:t xml:space="preserve"> </w:t>
+      </w:r>
+      <w:r>
+        <w:t xml:space="preserve">Geert programmeerde hiervoor een handig Python-script dat je </w:t>
+      </w:r>
+      <w:hyperlink r:id="rId24" w:history="1">
+        <w:r>
+          <w:rPr>
+            <w:rStyle w:val="Hyperlink"/>
+          </w:rPr>
+          <w:t>hier</w:t>
+        </w:r>
+      </w:hyperlink>
+      <w:r>
+        <w:t xml:space="preserve"> kan terugvinden. Met dit script krijg je (1) een overzicht van alle links die in </w:t>
+      </w:r>
+      <w:proofErr w:type="spellStart"/>
+      <w:r>
+        <w:t>Stories</w:t>
+      </w:r>
+      <w:proofErr w:type="spellEnd"/>
+      <w:r>
+        <w:t xml:space="preserve">-rapporten gebruikt worden, (2) een overzicht van alle viewer-presentaties in </w:t>
+      </w:r>
+      <w:proofErr w:type="spellStart"/>
+      <w:r>
+        <w:t>Stories</w:t>
+      </w:r>
+      <w:proofErr w:type="spellEnd"/>
+      <w:r>
+        <w:t>-rapporten en (3) links die niet (meer) werken.</w:t>
+      </w:r>
     </w:p>
     <w:p>
       <w:pPr>
@@ -2484,7 +2517,7 @@
       <w:r>
         <w:t xml:space="preserve">Voor alle afspraken, </w:t>
       </w:r>
-      <w:hyperlink r:id="rId24" w:history="1">
+      <w:hyperlink r:id="rId25" w:history="1">
         <w:r>
           <w:rPr>
             <w:rStyle w:val="Hyperlink"/>
@@ -2805,27 +2838,14 @@
       </w:r>
       <w:proofErr w:type="spellEnd"/>
       <w:r>
-        <w:t xml:space="preserve">’ in de indicatorenlijst van studio maar naar die van het thema in de </w:t>
-      </w:r>
-      <w:proofErr w:type="spellStart"/>
-      <w:r>
-        <w:t>CategoryTree</w:t>
-      </w:r>
-      <w:proofErr w:type="spellEnd"/>
+        <w:t>’ in de indicatorenlijst van studio maar naar die van het thema in de CategoryTree</w:t>
+      </w:r>
       <w:r>
         <w:br/>
       </w:r>
       <w:r>
         <w:br/>
-        <w:t xml:space="preserve">Uitleg: wanneer in themaboom twee indicatoren geselecteerd worden, krijgt presentatie de titel van de eerst bovenliggende gezamenlijke map. Wanneer dit niet nodig is, moet dit </w:t>
-      </w:r>
-      <w:proofErr w:type="spellStart"/>
-      <w:r>
-        <w:t>uitgevinkt</w:t>
-      </w:r>
-      <w:proofErr w:type="spellEnd"/>
-      <w:r>
-        <w:t xml:space="preserve"> worden (bv. Bij nietszeggende mapnaam als ‘aantal’ of ‘thema’.)</w:t>
+        <w:t>Uitleg: wanneer in themaboom twee indicatoren geselecteerd worden, krijgt presentatie de titel van de eerst bovenliggende gezamenlijke map. Wanneer dit niet nodig is, moet dit uitgevinkt worden (bv. Bij nietszeggende mapnaam als ‘aantal’ of ‘thema’.)</w:t>
       </w:r>
     </w:p>
     <w:p>
@@ -4977,31 +4997,6 @@
 </file>
 
 <file path=customXml/item1.xml><?xml version="1.0" encoding="utf-8"?>
-<?mso-contentType ?>
-<FormTemplates xmlns="http://schemas.microsoft.com/sharepoint/v3/contenttype/forms">
-  <Display>DocumentLibraryForm</Display>
-  <Edit>DocumentLibraryForm</Edit>
-  <New>DocumentLibraryForm</New>
-</FormTemplates>
-</file>
-
-<file path=customXml/item2.xml><?xml version="1.0" encoding="utf-8"?>
-<b:Sources xmlns:b="http://schemas.openxmlformats.org/officeDocument/2006/bibliography" xmlns="http://schemas.openxmlformats.org/officeDocument/2006/bibliography" SelectedStyle="\APASixthEditionOfficeOnline.xsl" StyleName="APA" Version="6"/>
-</file>
-
-<file path=customXml/item3.xml><?xml version="1.0" encoding="utf-8"?>
-<p:properties xmlns:p="http://schemas.microsoft.com/office/2006/metadata/properties" xmlns:xsi="http://www.w3.org/2001/XMLSchema-instance" xmlns:pc="http://schemas.microsoft.com/office/infopath/2007/PartnerControls">
-  <documentManagement>
-    <TaxCatchAll xmlns="3fe4ce35-33a6-4549-ad9a-d681415f09bc" xsi:nil="true"/>
-    <lcf76f155ced4ddcb4097134ff3c332f xmlns="50990e7d-986b-48ed-b7c7-e36476cb9bc9">
-      <Terms xmlns="http://schemas.microsoft.com/office/infopath/2007/PartnerControls"/>
-    </lcf76f155ced4ddcb4097134ff3c332f>
-    <SPFxTotalFileSize xmlns="3fe4ce35-33a6-4549-ad9a-d681415f09bc" xsi:nil="true"/>
-  </documentManagement>
-</p:properties>
-</file>
-
-<file path=customXml/item4.xml><?xml version="1.0" encoding="utf-8"?>
 <ct:contentTypeSchema xmlns:ct="http://schemas.microsoft.com/office/2006/metadata/contentType" xmlns:ma="http://schemas.microsoft.com/office/2006/metadata/properties/metaAttributes" ct:_="" ma:_="" ma:contentTypeName="Document" ma:contentTypeID="0x010100936F8FED91617845B8AEE40909B55B39" ma:contentTypeVersion="22" ma:contentTypeDescription="Een nieuw document maken." ma:contentTypeScope="" ma:versionID="408dc1e28d2a63c1dc5e68fe19e3fd51">
   <xsd:schema xmlns:xsd="http://www.w3.org/2001/XMLSchema" xmlns:xs="http://www.w3.org/2001/XMLSchema" xmlns:p="http://schemas.microsoft.com/office/2006/metadata/properties" xmlns:ns2="50990e7d-986b-48ed-b7c7-e36476cb9bc9" xmlns:ns3="3fe4ce35-33a6-4549-ad9a-d681415f09bc" targetNamespace="http://schemas.microsoft.com/office/2006/metadata/properties" ma:root="true" ma:fieldsID="4f2d0f3eb3fad191bdf2275537b96c6f" ns2:_="" ns3:_="">
     <xsd:import namespace="50990e7d-986b-48ed-b7c7-e36476cb9bc9"/>
@@ -5270,34 +5265,32 @@
 </ct:contentTypeSchema>
 </file>
 
-<file path=customXml/itemProps1.xml><?xml version="1.0" encoding="utf-8"?>
-<ds:datastoreItem xmlns:ds="http://schemas.openxmlformats.org/officeDocument/2006/customXml" ds:itemID="{F5D094D8-AC9D-416B-BED9-257323B2C80F}">
-  <ds:schemaRefs>
-    <ds:schemaRef ds:uri="http://schemas.microsoft.com/sharepoint/v3/contenttype/forms"/>
-  </ds:schemaRefs>
-</ds:datastoreItem>
+<file path=customXml/item2.xml><?xml version="1.0" encoding="utf-8"?>
+<p:properties xmlns:p="http://schemas.microsoft.com/office/2006/metadata/properties" xmlns:xsi="http://www.w3.org/2001/XMLSchema-instance" xmlns:pc="http://schemas.microsoft.com/office/infopath/2007/PartnerControls">
+  <documentManagement>
+    <TaxCatchAll xmlns="3fe4ce35-33a6-4549-ad9a-d681415f09bc" xsi:nil="true"/>
+    <lcf76f155ced4ddcb4097134ff3c332f xmlns="50990e7d-986b-48ed-b7c7-e36476cb9bc9">
+      <Terms xmlns="http://schemas.microsoft.com/office/infopath/2007/PartnerControls"/>
+    </lcf76f155ced4ddcb4097134ff3c332f>
+    <SPFxTotalFileSize xmlns="3fe4ce35-33a6-4549-ad9a-d681415f09bc" xsi:nil="true"/>
+  </documentManagement>
+</p:properties>
 </file>
 
-<file path=customXml/itemProps2.xml><?xml version="1.0" encoding="utf-8"?>
-<ds:datastoreItem xmlns:ds="http://schemas.openxmlformats.org/officeDocument/2006/customXml" ds:itemID="{B009148A-7493-4967-9363-D05D79894680}">
-  <ds:schemaRefs>
-    <ds:schemaRef ds:uri="http://schemas.openxmlformats.org/officeDocument/2006/bibliography"/>
-  </ds:schemaRefs>
-</ds:datastoreItem>
+<file path=customXml/item3.xml><?xml version="1.0" encoding="utf-8"?>
+<b:Sources xmlns:b="http://schemas.openxmlformats.org/officeDocument/2006/bibliography" xmlns="http://schemas.openxmlformats.org/officeDocument/2006/bibliography" SelectedStyle="\APASixthEditionOfficeOnline.xsl" StyleName="APA" Version="6"/>
 </file>
 
-<file path=customXml/itemProps3.xml><?xml version="1.0" encoding="utf-8"?>
-<ds:datastoreItem xmlns:ds="http://schemas.openxmlformats.org/officeDocument/2006/customXml" ds:itemID="{B06C5F85-37CE-4228-A896-654359A5B98C}">
-  <ds:schemaRefs>
-    <ds:schemaRef ds:uri="http://schemas.microsoft.com/office/2006/metadata/properties"/>
-    <ds:schemaRef ds:uri="http://schemas.microsoft.com/office/infopath/2007/PartnerControls"/>
-    <ds:schemaRef ds:uri="3fe4ce35-33a6-4549-ad9a-d681415f09bc"/>
-    <ds:schemaRef ds:uri="50990e7d-986b-48ed-b7c7-e36476cb9bc9"/>
-  </ds:schemaRefs>
-</ds:datastoreItem>
+<file path=customXml/item4.xml><?xml version="1.0" encoding="utf-8"?>
+<?mso-contentType ?>
+<FormTemplates xmlns="http://schemas.microsoft.com/sharepoint/v3/contenttype/forms">
+  <Display>DocumentLibraryForm</Display>
+  <Edit>DocumentLibraryForm</Edit>
+  <New>DocumentLibraryForm</New>
+</FormTemplates>
 </file>
 
-<file path=customXml/itemProps4.xml><?xml version="1.0" encoding="utf-8"?>
+<file path=customXml/itemProps1.xml><?xml version="1.0" encoding="utf-8"?>
 <ds:datastoreItem xmlns:ds="http://schemas.openxmlformats.org/officeDocument/2006/customXml" ds:itemID="{557243C2-C9FB-4972-88C0-3C34DEA41B90}">
   <ds:schemaRefs>
     <ds:schemaRef ds:uri="http://schemas.microsoft.com/office/2006/metadata/contentType"/>
@@ -5314,4 +5307,31 @@
     <ds:schemaRef ds:uri="http://schemas.microsoft.com/internal/obd"/>
   </ds:schemaRefs>
 </ds:datastoreItem>
+</file>
+
+<file path=customXml/itemProps2.xml><?xml version="1.0" encoding="utf-8"?>
+<ds:datastoreItem xmlns:ds="http://schemas.openxmlformats.org/officeDocument/2006/customXml" ds:itemID="{B06C5F85-37CE-4228-A896-654359A5B98C}">
+  <ds:schemaRefs>
+    <ds:schemaRef ds:uri="http://schemas.microsoft.com/office/2006/metadata/properties"/>
+    <ds:schemaRef ds:uri="http://schemas.microsoft.com/office/infopath/2007/PartnerControls"/>
+    <ds:schemaRef ds:uri="3fe4ce35-33a6-4549-ad9a-d681415f09bc"/>
+    <ds:schemaRef ds:uri="50990e7d-986b-48ed-b7c7-e36476cb9bc9"/>
+  </ds:schemaRefs>
+</ds:datastoreItem>
+</file>
+
+<file path=customXml/itemProps3.xml><?xml version="1.0" encoding="utf-8"?>
+<ds:datastoreItem xmlns:ds="http://schemas.openxmlformats.org/officeDocument/2006/customXml" ds:itemID="{B009148A-7493-4967-9363-D05D79894680}">
+  <ds:schemaRefs>
+    <ds:schemaRef ds:uri="http://schemas.openxmlformats.org/officeDocument/2006/bibliography"/>
+  </ds:schemaRefs>
+</ds:datastoreItem>
+</file>
+
+<file path=customXml/itemProps4.xml><?xml version="1.0" encoding="utf-8"?>
+<ds:datastoreItem xmlns:ds="http://schemas.openxmlformats.org/officeDocument/2006/customXml" ds:itemID="{F5D094D8-AC9D-416B-BED9-257323B2C80F}">
+  <ds:schemaRefs>
+    <ds:schemaRef ds:uri="http://schemas.microsoft.com/sharepoint/v3/contenttype/forms"/>
+  </ds:schemaRefs>
+</ds:datastoreItem>
 </file>
</xml_diff>

<commit_message>
update checklist links nieuwe tab
Links moeten openen in een nieuwe tab, zie https://github.com/provinciesincijfers/PinC-taakopvolging/issues/523#issuecomment-4225140923
</commit_message>
<xml_diff>
--- a/09. Controle/Checklist controle.docx
+++ b/09. Controle/Checklist controle.docx
@@ -2448,6 +2448,18 @@
         </w:numPr>
       </w:pPr>
       <w:r>
+        <w:t xml:space="preserve">Ga na of de links in een nieuwe tab geopend worden. </w:t>
+      </w:r>
+    </w:p>
+    <w:p>
+      <w:pPr>
+        <w:pStyle w:val="Lijstalinea"/>
+        <w:numPr>
+          <w:ilvl w:val="0"/>
+          <w:numId w:val="8"/>
+        </w:numPr>
+      </w:pPr>
+      <w:r>
         <w:t>Komen alle voetnoten en woorden uit het glossarium terug in de voetnoten en/of begrippenlijst achteraan het rapport?</w:t>
       </w:r>
     </w:p>
@@ -2660,6 +2672,7 @@
         <w:pStyle w:val="Kop2"/>
       </w:pPr>
       <w:r>
+        <w:lastRenderedPageBreak/>
         <w:t>Projectfiches</w:t>
       </w:r>
     </w:p>
@@ -4997,6 +5010,18 @@
 </file>
 
 <file path=customXml/item1.xml><?xml version="1.0" encoding="utf-8"?>
+<p:properties xmlns:p="http://schemas.microsoft.com/office/2006/metadata/properties" xmlns:xsi="http://www.w3.org/2001/XMLSchema-instance" xmlns:pc="http://schemas.microsoft.com/office/infopath/2007/PartnerControls">
+  <documentManagement>
+    <TaxCatchAll xmlns="3fe4ce35-33a6-4549-ad9a-d681415f09bc" xsi:nil="true"/>
+    <lcf76f155ced4ddcb4097134ff3c332f xmlns="50990e7d-986b-48ed-b7c7-e36476cb9bc9">
+      <Terms xmlns="http://schemas.microsoft.com/office/infopath/2007/PartnerControls"/>
+    </lcf76f155ced4ddcb4097134ff3c332f>
+    <SPFxTotalFileSize xmlns="3fe4ce35-33a6-4549-ad9a-d681415f09bc" xsi:nil="true"/>
+  </documentManagement>
+</p:properties>
+</file>
+
+<file path=customXml/item2.xml><?xml version="1.0" encoding="utf-8"?>
 <ct:contentTypeSchema xmlns:ct="http://schemas.microsoft.com/office/2006/metadata/contentType" xmlns:ma="http://schemas.microsoft.com/office/2006/metadata/properties/metaAttributes" ct:_="" ma:_="" ma:contentTypeName="Document" ma:contentTypeID="0x010100936F8FED91617845B8AEE40909B55B39" ma:contentTypeVersion="22" ma:contentTypeDescription="Een nieuw document maken." ma:contentTypeScope="" ma:versionID="408dc1e28d2a63c1dc5e68fe19e3fd51">
   <xsd:schema xmlns:xsd="http://www.w3.org/2001/XMLSchema" xmlns:xs="http://www.w3.org/2001/XMLSchema" xmlns:p="http://schemas.microsoft.com/office/2006/metadata/properties" xmlns:ns2="50990e7d-986b-48ed-b7c7-e36476cb9bc9" xmlns:ns3="3fe4ce35-33a6-4549-ad9a-d681415f09bc" targetNamespace="http://schemas.microsoft.com/office/2006/metadata/properties" ma:root="true" ma:fieldsID="4f2d0f3eb3fad191bdf2275537b96c6f" ns2:_="" ns3:_="">
     <xsd:import namespace="50990e7d-986b-48ed-b7c7-e36476cb9bc9"/>
@@ -5265,23 +5290,7 @@
 </ct:contentTypeSchema>
 </file>
 
-<file path=customXml/item2.xml><?xml version="1.0" encoding="utf-8"?>
-<p:properties xmlns:p="http://schemas.microsoft.com/office/2006/metadata/properties" xmlns:xsi="http://www.w3.org/2001/XMLSchema-instance" xmlns:pc="http://schemas.microsoft.com/office/infopath/2007/PartnerControls">
-  <documentManagement>
-    <TaxCatchAll xmlns="3fe4ce35-33a6-4549-ad9a-d681415f09bc" xsi:nil="true"/>
-    <lcf76f155ced4ddcb4097134ff3c332f xmlns="50990e7d-986b-48ed-b7c7-e36476cb9bc9">
-      <Terms xmlns="http://schemas.microsoft.com/office/infopath/2007/PartnerControls"/>
-    </lcf76f155ced4ddcb4097134ff3c332f>
-    <SPFxTotalFileSize xmlns="3fe4ce35-33a6-4549-ad9a-d681415f09bc" xsi:nil="true"/>
-  </documentManagement>
-</p:properties>
-</file>
-
 <file path=customXml/item3.xml><?xml version="1.0" encoding="utf-8"?>
-<b:Sources xmlns:b="http://schemas.openxmlformats.org/officeDocument/2006/bibliography" xmlns="http://schemas.openxmlformats.org/officeDocument/2006/bibliography" SelectedStyle="\APASixthEditionOfficeOnline.xsl" StyleName="APA" Version="6"/>
-</file>
-
-<file path=customXml/item4.xml><?xml version="1.0" encoding="utf-8"?>
 <?mso-contentType ?>
 <FormTemplates xmlns="http://schemas.microsoft.com/sharepoint/v3/contenttype/forms">
   <Display>DocumentLibraryForm</Display>
@@ -5290,7 +5299,22 @@
 </FormTemplates>
 </file>
 
+<file path=customXml/item4.xml><?xml version="1.0" encoding="utf-8"?>
+<b:Sources xmlns:b="http://schemas.openxmlformats.org/officeDocument/2006/bibliography" xmlns="http://schemas.openxmlformats.org/officeDocument/2006/bibliography" SelectedStyle="\APASixthEditionOfficeOnline.xsl" StyleName="APA" Version="6"/>
+</file>
+
 <file path=customXml/itemProps1.xml><?xml version="1.0" encoding="utf-8"?>
+<ds:datastoreItem xmlns:ds="http://schemas.openxmlformats.org/officeDocument/2006/customXml" ds:itemID="{B06C5F85-37CE-4228-A896-654359A5B98C}">
+  <ds:schemaRefs>
+    <ds:schemaRef ds:uri="http://schemas.microsoft.com/office/2006/metadata/properties"/>
+    <ds:schemaRef ds:uri="http://schemas.microsoft.com/office/infopath/2007/PartnerControls"/>
+    <ds:schemaRef ds:uri="3fe4ce35-33a6-4549-ad9a-d681415f09bc"/>
+    <ds:schemaRef ds:uri="50990e7d-986b-48ed-b7c7-e36476cb9bc9"/>
+  </ds:schemaRefs>
+</ds:datastoreItem>
+</file>
+
+<file path=customXml/itemProps2.xml><?xml version="1.0" encoding="utf-8"?>
 <ds:datastoreItem xmlns:ds="http://schemas.openxmlformats.org/officeDocument/2006/customXml" ds:itemID="{557243C2-C9FB-4972-88C0-3C34DEA41B90}">
   <ds:schemaRefs>
     <ds:schemaRef ds:uri="http://schemas.microsoft.com/office/2006/metadata/contentType"/>
@@ -5309,29 +5333,18 @@
 </ds:datastoreItem>
 </file>
 
-<file path=customXml/itemProps2.xml><?xml version="1.0" encoding="utf-8"?>
-<ds:datastoreItem xmlns:ds="http://schemas.openxmlformats.org/officeDocument/2006/customXml" ds:itemID="{B06C5F85-37CE-4228-A896-654359A5B98C}">
+<file path=customXml/itemProps3.xml><?xml version="1.0" encoding="utf-8"?>
+<ds:datastoreItem xmlns:ds="http://schemas.openxmlformats.org/officeDocument/2006/customXml" ds:itemID="{F5D094D8-AC9D-416B-BED9-257323B2C80F}">
   <ds:schemaRefs>
-    <ds:schemaRef ds:uri="http://schemas.microsoft.com/office/2006/metadata/properties"/>
-    <ds:schemaRef ds:uri="http://schemas.microsoft.com/office/infopath/2007/PartnerControls"/>
-    <ds:schemaRef ds:uri="3fe4ce35-33a6-4549-ad9a-d681415f09bc"/>
-    <ds:schemaRef ds:uri="50990e7d-986b-48ed-b7c7-e36476cb9bc9"/>
+    <ds:schemaRef ds:uri="http://schemas.microsoft.com/sharepoint/v3/contenttype/forms"/>
   </ds:schemaRefs>
 </ds:datastoreItem>
 </file>
 
-<file path=customXml/itemProps3.xml><?xml version="1.0" encoding="utf-8"?>
+<file path=customXml/itemProps4.xml><?xml version="1.0" encoding="utf-8"?>
 <ds:datastoreItem xmlns:ds="http://schemas.openxmlformats.org/officeDocument/2006/customXml" ds:itemID="{B009148A-7493-4967-9363-D05D79894680}">
   <ds:schemaRefs>
     <ds:schemaRef ds:uri="http://schemas.openxmlformats.org/officeDocument/2006/bibliography"/>
   </ds:schemaRefs>
 </ds:datastoreItem>
-</file>
-
-<file path=customXml/itemProps4.xml><?xml version="1.0" encoding="utf-8"?>
-<ds:datastoreItem xmlns:ds="http://schemas.openxmlformats.org/officeDocument/2006/customXml" ds:itemID="{F5D094D8-AC9D-416B-BED9-257323B2C80F}">
-  <ds:schemaRefs>
-    <ds:schemaRef ds:uri="http://schemas.microsoft.com/sharepoint/v3/contenttype/forms"/>
-  </ds:schemaRefs>
-</ds:datastoreItem>
 </file>
</xml_diff>

<commit_message>
update nav nieuwe dashboards
https://github.com/provinciesincijfers/PinC-taakopvolging/issues/557
</commit_message>
<xml_diff>
--- a/09. Controle/Checklist controle.docx
+++ b/09. Controle/Checklist controle.docx
@@ -45,21 +45,7 @@
         <w:rPr>
           <w:b/>
         </w:rPr>
-        <w:t xml:space="preserve">, van </w:t>
-      </w:r>
-      <w:proofErr w:type="spellStart"/>
-      <w:r>
-        <w:rPr>
-          <w:b/>
-        </w:rPr>
-        <w:t>metadatafiches</w:t>
-      </w:r>
-      <w:proofErr w:type="spellEnd"/>
-      <w:r>
-        <w:rPr>
-          <w:b/>
-        </w:rPr>
-        <w:t>, rapporten en het dashboard</w:t>
+        <w:t>, van metadatafiches, rapporten en het dashboard</w:t>
       </w:r>
       <w:r>
         <w:rPr>
@@ -153,14 +139,12 @@
         </w:rPr>
         <w:t xml:space="preserve">afspraken bij het maken van </w:t>
       </w:r>
-      <w:proofErr w:type="spellStart"/>
       <w:r>
         <w:rPr>
           <w:b/>
         </w:rPr>
         <w:t>stories</w:t>
       </w:r>
-      <w:proofErr w:type="spellEnd"/>
       <w:r>
         <w:rPr>
           <w:bCs/>
@@ -266,19 +250,29 @@
           <w:bCs/>
         </w:rPr>
       </w:pPr>
-      <w:proofErr w:type="spellStart"/>
       <w:r>
         <w:rPr>
           <w:bCs/>
         </w:rPr>
-        <w:t>Steekproefgewijs</w:t>
-      </w:r>
-      <w:proofErr w:type="spellEnd"/>
-      <w:r>
+        <w:t>Steekproefgewijs controleren van reeds beschikbare cijfers</w:t>
+      </w:r>
+    </w:p>
+    <w:p>
+      <w:pPr>
+        <w:pStyle w:val="Lijstalinea"/>
+        <w:numPr>
+          <w:ilvl w:val="0"/>
+          <w:numId w:val="9"/>
+        </w:numPr>
         <w:rPr>
           <w:bCs/>
         </w:rPr>
-        <w:t xml:space="preserve"> controleren van reeds beschikbare cijfers</w:t>
+      </w:pPr>
+      <w:r>
+        <w:rPr>
+          <w:bCs/>
+        </w:rPr>
+        <w:t>Een nieuw rapport</w:t>
       </w:r>
     </w:p>
     <w:p>
@@ -296,12 +290,39 @@
         <w:rPr>
           <w:bCs/>
         </w:rPr>
-        <w:t>Een nieuw rapport</w:t>
+        <w:t>Een nieuw dashboard</w:t>
       </w:r>
     </w:p>
     <w:p>
       <w:pPr>
         <w:pStyle w:val="Lijstalinea"/>
+        <w:rPr>
+          <w:bCs/>
+        </w:rPr>
+      </w:pPr>
+    </w:p>
+    <w:p>
+      <w:pPr>
+        <w:rPr>
+          <w:bCs/>
+        </w:rPr>
+      </w:pPr>
+      <w:r>
+        <w:rPr>
+          <w:bCs/>
+        </w:rPr>
+        <w:t>I</w:t>
+      </w:r>
+      <w:r>
+        <w:rPr>
+          <w:bCs/>
+        </w:rPr>
+        <w:t>ndien het louter om een update van de cijfers gaat:</w:t>
+      </w:r>
+    </w:p>
+    <w:p>
+      <w:pPr>
+        <w:pStyle w:val="Lijstalinea"/>
         <w:numPr>
           <w:ilvl w:val="0"/>
           <w:numId w:val="9"/>
@@ -314,75 +335,16 @@
         <w:rPr>
           <w:bCs/>
         </w:rPr>
-        <w:t>Een nieuw dashboard</w:t>
+        <w:t>Af en toe kan het (steekproefgewijs) toch interessant zijn om een grondige controle uit te voeren.</w:t>
       </w:r>
     </w:p>
     <w:p>
       <w:pPr>
         <w:pStyle w:val="Lijstalinea"/>
-        <w:rPr>
-          <w:bCs/>
-        </w:rPr>
-      </w:pPr>
-    </w:p>
-    <w:p>
-      <w:pPr>
-        <w:rPr>
-          <w:bCs/>
-        </w:rPr>
-      </w:pPr>
-      <w:r>
-        <w:rPr>
-          <w:bCs/>
-        </w:rPr>
-        <w:t>I</w:t>
-      </w:r>
-      <w:r>
-        <w:rPr>
-          <w:bCs/>
-        </w:rPr>
-        <w:t>ndien het louter om een update van de cijfers gaat:</w:t>
-      </w:r>
-    </w:p>
-    <w:p>
-      <w:pPr>
-        <w:pStyle w:val="Lijstalinea"/>
         <w:numPr>
           <w:ilvl w:val="0"/>
           <w:numId w:val="9"/>
         </w:numPr>
-        <w:rPr>
-          <w:bCs/>
-        </w:rPr>
-      </w:pPr>
-      <w:r>
-        <w:rPr>
-          <w:bCs/>
-        </w:rPr>
-        <w:t>Af en toe kan het (</w:t>
-      </w:r>
-      <w:proofErr w:type="spellStart"/>
-      <w:r>
-        <w:rPr>
-          <w:bCs/>
-        </w:rPr>
-        <w:t>steekproefgewijs</w:t>
-      </w:r>
-      <w:proofErr w:type="spellEnd"/>
-      <w:r>
-        <w:rPr>
-          <w:bCs/>
-        </w:rPr>
-        <w:t>) toch interessant zijn om een grondige controle uit te voeren.</w:t>
-      </w:r>
-    </w:p>
-    <w:p>
-      <w:pPr>
-        <w:pStyle w:val="Lijstalinea"/>
-        <w:numPr>
-          <w:ilvl w:val="0"/>
-          <w:numId w:val="9"/>
-        </w:numPr>
       </w:pPr>
       <w:r>
         <w:t xml:space="preserve">Manu </w:t>
@@ -391,15 +353,7 @@
         <w:t xml:space="preserve">werkte een python-script uit </w:t>
       </w:r>
       <w:r>
-        <w:t xml:space="preserve">dat checkt op </w:t>
-      </w:r>
-      <w:proofErr w:type="spellStart"/>
-      <w:r>
-        <w:t>outliers</w:t>
-      </w:r>
-      <w:proofErr w:type="spellEnd"/>
-      <w:r>
-        <w:t xml:space="preserve"> – </w:t>
+        <w:t xml:space="preserve">dat checkt op outliers – </w:t>
       </w:r>
       <w:r>
         <w:t xml:space="preserve">Dit kan helpen om te controleren of de cijfers juist zijn en evoluties plausibel zijn: </w:t>
@@ -467,15 +421,7 @@
         <w:ind w:left="714" w:hanging="357"/>
       </w:pPr>
       <w:r>
-        <w:t xml:space="preserve">Is voor alle onderwerpen een </w:t>
-      </w:r>
-      <w:proofErr w:type="spellStart"/>
-      <w:r>
-        <w:t>metadatafiche</w:t>
-      </w:r>
-      <w:proofErr w:type="spellEnd"/>
-      <w:r>
-        <w:t xml:space="preserve"> aanwezig?</w:t>
+        <w:t>Is voor alle onderwerpen een metadatafiche aanwezig?</w:t>
       </w:r>
     </w:p>
     <w:p>
@@ -537,15 +483,7 @@
         <w:ind w:left="714" w:hanging="357"/>
       </w:pPr>
       <w:r>
-        <w:t xml:space="preserve">Staan de percentages in een </w:t>
-      </w:r>
-      <w:proofErr w:type="spellStart"/>
-      <w:r>
-        <w:t>submap</w:t>
-      </w:r>
-      <w:proofErr w:type="spellEnd"/>
-      <w:r>
-        <w:t xml:space="preserve"> indien er meer dan 12 onderwerpen in totaal zijn?</w:t>
+        <w:t>Staan de percentages in een submap indien er meer dan 12 onderwerpen in totaal zijn?</w:t>
       </w:r>
       <w:r>
         <w:t xml:space="preserve"> </w:t>
@@ -561,15 +499,7 @@
         <w:ind w:left="714" w:hanging="357"/>
       </w:pPr>
       <w:r>
-        <w:t xml:space="preserve">Naam van de </w:t>
-      </w:r>
-      <w:proofErr w:type="spellStart"/>
-      <w:r>
-        <w:t>submap</w:t>
-      </w:r>
-      <w:proofErr w:type="spellEnd"/>
-      <w:r>
-        <w:t xml:space="preserve"> is </w:t>
+        <w:t xml:space="preserve">Naam van de submap is </w:t>
       </w:r>
       <w:r>
         <w:t>“</w:t>
@@ -648,15 +578,7 @@
         <w:ind w:left="714" w:hanging="357"/>
       </w:pPr>
       <w:r>
-        <w:t xml:space="preserve">Als de data op </w:t>
-      </w:r>
-      <w:proofErr w:type="spellStart"/>
-      <w:r>
-        <w:t>statsec</w:t>
-      </w:r>
-      <w:proofErr w:type="spellEnd"/>
-      <w:r>
-        <w:t xml:space="preserve"> beschikbaar is, staat het ook in de map GEBIEDSINDELINGEN &gt; </w:t>
+        <w:t xml:space="preserve">Als de data op statsec beschikbaar is, staat het ook in de map GEBIEDSINDELINGEN &gt; </w:t>
       </w:r>
       <w:r>
         <w:t>Beschikbaar vanaf statistische sector</w:t>
@@ -675,15 +597,7 @@
         <w:ind w:left="714" w:hanging="357"/>
       </w:pPr>
       <w:r>
-        <w:t xml:space="preserve">Is de data op </w:t>
-      </w:r>
-      <w:proofErr w:type="spellStart"/>
-      <w:r>
-        <w:t>statsec</w:t>
-      </w:r>
-      <w:proofErr w:type="spellEnd"/>
-      <w:r>
-        <w:t xml:space="preserve"> ook beschikbaar zonder inloggen?</w:t>
+        <w:t>Is de data op statsec ook beschikbaar zonder inloggen?</w:t>
       </w:r>
     </w:p>
     <w:p>
@@ -720,14 +634,12 @@
         <w:t xml:space="preserve">Zie informatie over de belangrijkste velden op </w:t>
       </w:r>
       <w:hyperlink r:id="rId15" w:history="1">
-        <w:proofErr w:type="spellStart"/>
         <w:r>
           <w:rPr>
             <w:rStyle w:val="Hyperlink"/>
           </w:rPr>
           <w:t>Github</w:t>
         </w:r>
-        <w:proofErr w:type="spellEnd"/>
       </w:hyperlink>
       <w:r>
         <w:rPr>
@@ -748,37 +660,13 @@
         <w:t xml:space="preserve">Zichtbaarheid van mapnamen in presentaties: </w:t>
       </w:r>
       <w:r>
-        <w:t>“</w:t>
-      </w:r>
-      <w:proofErr w:type="spellStart"/>
-      <w:r>
-        <w:t>Visible</w:t>
-      </w:r>
-      <w:proofErr w:type="spellEnd"/>
-      <w:r>
-        <w:t xml:space="preserve"> in </w:t>
-      </w:r>
-      <w:proofErr w:type="spellStart"/>
-      <w:r>
-        <w:t>title</w:t>
-      </w:r>
-      <w:proofErr w:type="spellEnd"/>
-      <w:r>
-        <w:t xml:space="preserve">” </w:t>
+        <w:t xml:space="preserve">“Visible in title” </w:t>
       </w:r>
       <w:r>
         <w:t>uitvinken indien nodig</w:t>
       </w:r>
       <w:r>
-        <w:t xml:space="preserve"> (menu </w:t>
-      </w:r>
-      <w:proofErr w:type="spellStart"/>
-      <w:r>
-        <w:t>Edit</w:t>
-      </w:r>
-      <w:proofErr w:type="spellEnd"/>
-      <w:r>
-        <w:t xml:space="preserve"> achter rechtermuisklik op map)</w:t>
+        <w:t xml:space="preserve"> (menu Edit achter rechtermuisklik op map)</w:t>
       </w:r>
       <w:r>
         <w:rPr>
@@ -1016,9 +904,8 @@
           <w:szCs w:val="21"/>
           <w:lang w:eastAsia="nl-BE"/>
         </w:rPr>
-        <w:t>Woord gemiddelde enkel gebruiken in onderwerpnaam indien nodig voor leesbaarheid (</w:t>
-      </w:r>
-      <w:proofErr w:type="spellStart"/>
+        <w:t>Woord gemiddelde enkel gebruiken in onderwerpnaam indien nodig voor leesbaarheid (vb "gemiddelde temperatuur" wél, maar gewoon "E-peil appartementen"</w:t>
+      </w:r>
       <w:r>
         <w:rPr>
           <w:rFonts w:ascii="Segoe UI" w:eastAsia="Times New Roman" w:hAnsi="Segoe UI" w:cs="Segoe UI"/>
@@ -1027,27 +914,6 @@
           <w:szCs w:val="21"/>
           <w:lang w:eastAsia="nl-BE"/>
         </w:rPr>
-        <w:t>vb</w:t>
-      </w:r>
-      <w:proofErr w:type="spellEnd"/>
-      <w:r>
-        <w:rPr>
-          <w:rFonts w:ascii="Segoe UI" w:eastAsia="Times New Roman" w:hAnsi="Segoe UI" w:cs="Segoe UI"/>
-          <w:color w:val="24292E"/>
-          <w:sz w:val="21"/>
-          <w:szCs w:val="21"/>
-          <w:lang w:eastAsia="nl-BE"/>
-        </w:rPr>
-        <w:t xml:space="preserve"> "gemiddelde temperatuur" wél, maar gewoon "E-peil appartementen"</w:t>
-      </w:r>
-      <w:r>
-        <w:rPr>
-          <w:rFonts w:ascii="Segoe UI" w:eastAsia="Times New Roman" w:hAnsi="Segoe UI" w:cs="Segoe UI"/>
-          <w:color w:val="24292E"/>
-          <w:sz w:val="21"/>
-          <w:szCs w:val="21"/>
-          <w:lang w:eastAsia="nl-BE"/>
-        </w:rPr>
         <w:t>.</w:t>
       </w:r>
     </w:p>
@@ -1066,21 +932,7 @@
         <w:rPr>
           <w:rFonts w:eastAsiaTheme="minorEastAsia"/>
         </w:rPr>
-        <w:t xml:space="preserve">Percentage worden omgeschreven met (t.o.v. x), </w:t>
-      </w:r>
-      <w:proofErr w:type="spellStart"/>
-      <w:r>
-        <w:rPr>
-          <w:rFonts w:eastAsiaTheme="minorEastAsia"/>
-        </w:rPr>
-        <w:t>promilles</w:t>
-      </w:r>
-      <w:proofErr w:type="spellEnd"/>
-      <w:r>
-        <w:rPr>
-          <w:rFonts w:eastAsiaTheme="minorEastAsia"/>
-        </w:rPr>
-        <w:t xml:space="preserve"> met per </w:t>
+        <w:t xml:space="preserve">Percentage worden omgeschreven met (t.o.v. x), promilles met per </w:t>
       </w:r>
       <w:r>
         <w:rPr>
@@ -1228,23 +1080,7 @@
         <w:spacing w:after="120" w:line="240" w:lineRule="auto"/>
       </w:pPr>
       <w:r>
-        <w:t xml:space="preserve">Kortere versies zijn toegestaan in naam onderwerp in databank, </w:t>
-      </w:r>
-      <w:proofErr w:type="spellStart"/>
-      <w:r>
-        <w:t>o.w.v</w:t>
-      </w:r>
-      <w:proofErr w:type="spellEnd"/>
-      <w:r>
-        <w:t xml:space="preserve">. beperkt aantal tekens (in dashboard wordt alles voluit geschreven </w:t>
-      </w:r>
-      <w:proofErr w:type="spellStart"/>
-      <w:r>
-        <w:t>o.w.v</w:t>
-      </w:r>
-      <w:proofErr w:type="spellEnd"/>
-      <w:r>
-        <w:t>. de leesbaarheid)</w:t>
+        <w:t>Kortere versies zijn toegestaan in naam onderwerp in databank, o.w.v. beperkt aantal tekens (in dashboard wordt alles voluit geschreven o.w.v. de leesbaarheid)</w:t>
       </w:r>
       <w:r>
         <w:t>.</w:t>
@@ -1271,14 +1107,24 @@
         <w:t xml:space="preserve">Zie informatie over de belangrijkste velden op </w:t>
       </w:r>
       <w:hyperlink r:id="rId19" w:history="1">
-        <w:proofErr w:type="spellStart"/>
         <w:r>
           <w:rPr>
             <w:rStyle w:val="Hyperlink"/>
           </w:rPr>
-          <w:t>Github</w:t>
+          <w:t>Gi</w:t>
         </w:r>
-        <w:proofErr w:type="spellEnd"/>
+        <w:r>
+          <w:rPr>
+            <w:rStyle w:val="Hyperlink"/>
+          </w:rPr>
+          <w:t>t</w:t>
+        </w:r>
+        <w:r>
+          <w:rPr>
+            <w:rStyle w:val="Hyperlink"/>
+          </w:rPr>
+          <w:t>hub</w:t>
+        </w:r>
       </w:hyperlink>
       <w:r>
         <w:rPr>
@@ -1439,6 +1285,36 @@
     </w:p>
     <w:p>
       <w:pPr>
+        <w:numPr>
+          <w:ilvl w:val="0"/>
+          <w:numId w:val="1"/>
+        </w:numPr>
+        <w:spacing w:after="120" w:line="240" w:lineRule="auto"/>
+      </w:pPr>
+      <w:r>
+        <w:t>RG 21/04/2026: Uitbreiding beschrijving</w:t>
+      </w:r>
+      <w:r>
+        <w:t xml:space="preserve">: </w:t>
+      </w:r>
+      <w:r>
+        <w:t xml:space="preserve">we breiden de beschrijving uit, te beginnen met de indicatoren die in dashboards en stories voorkomen. De beschrijving mag niet te lang zijn maar bij voorkeur ook niet gewoon de naam van de indicator, tenzij het heel duidelijk is. </w:t>
+      </w:r>
+    </w:p>
+    <w:p>
+      <w:pPr>
+        <w:spacing w:after="120" w:line="240" w:lineRule="auto"/>
+        <w:ind w:left="1440"/>
+      </w:pPr>
+    </w:p>
+    <w:p>
+      <w:pPr>
+        <w:spacing w:after="120" w:line="240" w:lineRule="auto"/>
+        <w:ind w:left="1440"/>
+      </w:pPr>
+    </w:p>
+    <w:p>
+      <w:pPr>
         <w:pStyle w:val="Kop2"/>
       </w:pPr>
       <w:r>
@@ -1462,23 +1338,7 @@
         <w:t>Zijn de cijfers juist?</w:t>
       </w:r>
       <w:r>
-        <w:t xml:space="preserve"> Vergelijk de nieuwe jaargang met vorige jaargangen – zijn de evoluties plausibel? Doe dit zeker ook op </w:t>
-      </w:r>
-      <w:proofErr w:type="spellStart"/>
-      <w:r>
-        <w:t>subgemeentelijk</w:t>
-      </w:r>
-      <w:proofErr w:type="spellEnd"/>
-      <w:r>
-        <w:t xml:space="preserve"> niveau indien van toepassing. Indien meerdere jaren vernieuwd worden: vergelijk de cijfers in de </w:t>
-      </w:r>
-      <w:proofErr w:type="spellStart"/>
-      <w:r>
-        <w:t>admin</w:t>
-      </w:r>
-      <w:proofErr w:type="spellEnd"/>
-      <w:r>
-        <w:t xml:space="preserve">/jive met de reeds gepubliceerde cijfers. Vergelijk de ingelezen cijfers met de ruwe data of eventuele elders gepubliceerde cijfers. </w:t>
+        <w:t xml:space="preserve"> Vergelijk de nieuwe jaargang met vorige jaargangen – zijn de evoluties plausibel? Doe dit zeker ook op subgemeentelijk niveau indien van toepassing. Indien meerdere jaren vernieuwd worden: vergelijk de cijfers in de admin/jive met de reeds gepubliceerde cijfers. Vergelijk de ingelezen cijfers met de ruwe data of eventuele elders gepubliceerde cijfers. </w:t>
       </w:r>
       <w:r>
         <w:t>Controleer de waarden van door jou gekende regio of gemeenten. Lijken de resultaten geloofwaardig?</w:t>
@@ -1514,16 +1374,8 @@
           <w:rPr>
             <w:rStyle w:val="Hyperlink"/>
           </w:rPr>
-          <w:t xml:space="preserve">Missing </w:t>
+          <w:t>Missing values</w:t>
         </w:r>
-        <w:proofErr w:type="spellStart"/>
-        <w:r>
-          <w:rPr>
-            <w:rStyle w:val="Hyperlink"/>
-          </w:rPr>
-          <w:t>values</w:t>
-        </w:r>
-        <w:proofErr w:type="spellEnd"/>
       </w:hyperlink>
       <w:r>
         <w:rPr>
@@ -1574,15 +1426,7 @@
         <w:t>Consequent gebruik van eenheid (en combinatie met datatype), bijvoorbeeld bij oppervlakte</w:t>
       </w:r>
       <w:r>
-        <w:t xml:space="preserve">. Gebruik </w:t>
-      </w:r>
-      <w:proofErr w:type="spellStart"/>
-      <w:r>
-        <w:t>Mean</w:t>
-      </w:r>
-      <w:proofErr w:type="spellEnd"/>
-      <w:r>
-        <w:t xml:space="preserve"> / Ratio</w:t>
+        <w:t>. Gebruik Mean / Ratio</w:t>
       </w:r>
       <w:r>
         <w:t>.</w:t>
@@ -1615,6 +1459,7 @@
         <w:spacing w:after="120" w:line="240" w:lineRule="auto"/>
       </w:pPr>
       <w:r>
+        <w:lastRenderedPageBreak/>
         <w:t>Zijn de data voor alle Vlaamse gemeenten ingeladen? Als er data beschikbaar zijn voor Brussel, zijn deze dan ook ingeladen?</w:t>
       </w:r>
     </w:p>
@@ -1639,7 +1484,6 @@
         <w:spacing w:after="120" w:line="240" w:lineRule="auto"/>
       </w:pPr>
       <w:r>
-        <w:lastRenderedPageBreak/>
         <w:t>Zijn de data voor alle relevante niveaus ingeladen wanneer er data hard ingelezen wordt (m.a.w. wanneer er niet geaggregeerd wordt).</w:t>
       </w:r>
     </w:p>
@@ -1652,15 +1496,7 @@
         <w:spacing w:after="120" w:line="240" w:lineRule="auto"/>
       </w:pPr>
       <w:r>
-        <w:t xml:space="preserve">Is niet-aggregeerbare data effectief </w:t>
-      </w:r>
-      <w:proofErr w:type="spellStart"/>
-      <w:r>
-        <w:t>onbeschikbaar</w:t>
-      </w:r>
-      <w:proofErr w:type="spellEnd"/>
-      <w:r>
-        <w:t xml:space="preserve"> op hogere gebiedsniveaus (staat de aggregatie uit)? </w:t>
+        <w:t xml:space="preserve">Is niet-aggregeerbare data effectief onbeschikbaar op hogere gebiedsniveaus (staat de aggregatie uit)? </w:t>
       </w:r>
     </w:p>
     <w:p>
@@ -1696,43 +1532,19 @@
         <w:spacing w:after="120" w:line="240" w:lineRule="auto"/>
       </w:pPr>
       <w:r>
-        <w:t xml:space="preserve">Voor data op </w:t>
-      </w:r>
-      <w:proofErr w:type="spellStart"/>
-      <w:r>
-        <w:t>statsec</w:t>
-      </w:r>
-      <w:proofErr w:type="spellEnd"/>
-      <w:r>
-        <w:t>-niveau: werden de data op het nieuwe gebiedsniveau ingeladen?</w:t>
-      </w:r>
-    </w:p>
-    <w:p>
-      <w:pPr>
-        <w:numPr>
-          <w:ilvl w:val="0"/>
-          <w:numId w:val="1"/>
-        </w:numPr>
-        <w:spacing w:after="120" w:line="240" w:lineRule="auto"/>
-      </w:pPr>
-      <w:r>
-        <w:t xml:space="preserve">Als de data </w:t>
-      </w:r>
-      <w:proofErr w:type="spellStart"/>
-      <w:r>
-        <w:t>subgemeentelijk</w:t>
-      </w:r>
-      <w:proofErr w:type="spellEnd"/>
-      <w:r>
-        <w:t xml:space="preserve"> beschikbaar is: zijn ze ZONDER INLOGGEN beschikbaar? Check ook </w:t>
-      </w:r>
-      <w:proofErr w:type="spellStart"/>
-      <w:r>
-        <w:t>subgemeentelijk</w:t>
-      </w:r>
-      <w:proofErr w:type="spellEnd"/>
-      <w:r>
-        <w:t xml:space="preserve"> wat je op gemeentelijk niveau zou doen.</w:t>
+        <w:t>Voor data op statsec-niveau: werden de data op het nieuwe gebiedsniveau ingeladen?</w:t>
+      </w:r>
+    </w:p>
+    <w:p>
+      <w:pPr>
+        <w:numPr>
+          <w:ilvl w:val="0"/>
+          <w:numId w:val="1"/>
+        </w:numPr>
+        <w:spacing w:after="120" w:line="240" w:lineRule="auto"/>
+      </w:pPr>
+      <w:r>
+        <w:t>Als de data subgemeentelijk beschikbaar is: zijn ze ZONDER INLOGGEN beschikbaar? Check ook subgemeentelijk wat je op gemeentelijk niveau zou doen.</w:t>
       </w:r>
     </w:p>
     <w:p>
@@ -1862,15 +1674,7 @@
         <w:spacing w:after="120" w:line="240" w:lineRule="auto"/>
       </w:pPr>
       <w:r>
-        <w:t xml:space="preserve">Kloppen de dimensies bij de kubussen (bv. geen </w:t>
-      </w:r>
-      <w:proofErr w:type="spellStart"/>
-      <w:r>
-        <w:t>dubbels</w:t>
-      </w:r>
-      <w:proofErr w:type="spellEnd"/>
-      <w:r>
-        <w:t>)?</w:t>
+        <w:t>Kloppen de dimensies bij de kubussen (bv. geen dubbels)?</w:t>
       </w:r>
       <w:r>
         <w:t xml:space="preserve"> Zijn de dimensies ook zichtbaar zonder inloggen?</w:t>
@@ -1914,14 +1718,13 @@
           <w:lang w:val="en-GB"/>
         </w:rPr>
       </w:pPr>
-      <w:proofErr w:type="spellStart"/>
       <w:r>
         <w:rPr>
           <w:lang w:val="en-GB"/>
         </w:rPr>
+        <w:lastRenderedPageBreak/>
         <w:t>Metadatafiches</w:t>
       </w:r>
-      <w:proofErr w:type="spellEnd"/>
     </w:p>
     <w:p>
       <w:pPr>
@@ -1929,76 +1732,18 @@
           <w:lang w:val="en-GB"/>
         </w:rPr>
       </w:pPr>
-      <w:proofErr w:type="spellStart"/>
       <w:r>
         <w:rPr>
           <w:lang w:val="en-GB"/>
         </w:rPr>
-        <w:t>Zie</w:t>
-      </w:r>
-      <w:proofErr w:type="spellEnd"/>
+        <w:t>Zie Teams: Uploadfiles PinC &gt; 00 M</w:t>
+      </w:r>
       <w:r>
         <w:rPr>
           <w:lang w:val="en-GB"/>
         </w:rPr>
-        <w:t xml:space="preserve"> Teams: </w:t>
-      </w:r>
-      <w:proofErr w:type="spellStart"/>
-      <w:r>
-        <w:rPr>
-          <w:lang w:val="en-GB"/>
-        </w:rPr>
-        <w:t>Uploadfiles</w:t>
-      </w:r>
-      <w:proofErr w:type="spellEnd"/>
-      <w:r>
-        <w:rPr>
-          <w:lang w:val="en-GB"/>
-        </w:rPr>
-        <w:t xml:space="preserve"> </w:t>
-      </w:r>
-      <w:proofErr w:type="spellStart"/>
-      <w:r>
-        <w:rPr>
-          <w:lang w:val="en-GB"/>
-        </w:rPr>
-        <w:t>PinC</w:t>
-      </w:r>
-      <w:proofErr w:type="spellEnd"/>
-      <w:r>
-        <w:rPr>
-          <w:lang w:val="en-GB"/>
-        </w:rPr>
-        <w:t xml:space="preserve"> &gt; 00 </w:t>
-      </w:r>
-      <w:proofErr w:type="spellStart"/>
-      <w:r>
-        <w:rPr>
-          <w:lang w:val="en-GB"/>
-        </w:rPr>
-        <w:t>M</w:t>
-      </w:r>
-      <w:r>
-        <w:rPr>
-          <w:lang w:val="en-GB"/>
-        </w:rPr>
-        <w:t>etadatafiches</w:t>
-      </w:r>
-      <w:proofErr w:type="spellEnd"/>
-      <w:r>
-        <w:rPr>
-          <w:lang w:val="en-GB"/>
-        </w:rPr>
-        <w:t xml:space="preserve"> </w:t>
-      </w:r>
-      <w:proofErr w:type="spellStart"/>
-      <w:r>
-        <w:rPr>
-          <w:lang w:val="en-GB"/>
-        </w:rPr>
-        <w:t>PinC</w:t>
-      </w:r>
-      <w:proofErr w:type="spellEnd"/>
+        <w:t>etadatafiches PinC</w:t>
+      </w:r>
     </w:p>
     <w:p>
       <w:pPr>
@@ -2021,7 +1766,6 @@
         <w:spacing w:after="120" w:line="240" w:lineRule="auto"/>
       </w:pPr>
       <w:r>
-        <w:lastRenderedPageBreak/>
         <w:t>Zit er helemaal in het begin van de beschrijving een korte omschrijving van de bron?</w:t>
       </w:r>
     </w:p>
@@ -2124,15 +1868,7 @@
         <w:spacing w:after="120" w:line="240" w:lineRule="auto"/>
       </w:pPr>
       <w:r>
-        <w:t>Wordt bij dataleverancier voldoende gedetailleerd vermeld wat de bron van de data is? (bv. niet enkel ‘</w:t>
-      </w:r>
-      <w:proofErr w:type="spellStart"/>
-      <w:r>
-        <w:t>Statbel</w:t>
-      </w:r>
-      <w:proofErr w:type="spellEnd"/>
-      <w:r>
-        <w:t>’, maar ook ‘landbouwtelling’)</w:t>
+        <w:t>Wordt bij dataleverancier voldoende gedetailleerd vermeld wat de bron van de data is? (bv. niet enkel ‘Statbel’, maar ook ‘landbouwtelling’)</w:t>
       </w:r>
     </w:p>
     <w:p>
@@ -2260,14 +1996,83 @@
         </w:numPr>
       </w:pPr>
       <w:r>
-        <w:t xml:space="preserve">Zijn alle relevante indicatoren opgenomen? Bekijk dit ook zeker wanneer je een rapport uit de oude rapportenmodule omzet naar </w:t>
-      </w:r>
-      <w:proofErr w:type="spellStart"/>
-      <w:r>
-        <w:t>stories</w:t>
-      </w:r>
-      <w:proofErr w:type="spellEnd"/>
-      <w:r>
+        <w:t>Zijn alle relevante indicatoren opgenomen? Bekijk dit ook zeker wanneer je een rapport uit de oude rapportenmodule omzet naar stories.</w:t>
+      </w:r>
+    </w:p>
+    <w:p>
+      <w:pPr>
+        <w:pStyle w:val="Lijstalinea"/>
+        <w:numPr>
+          <w:ilvl w:val="0"/>
+          <w:numId w:val="8"/>
+        </w:numPr>
+      </w:pPr>
+      <w:r>
+        <w:t>(Wanneer je rapport wordt omgezet of een update krijgt): Staan er zaken in het rapport die beter geschrapt zouden worden?</w:t>
+      </w:r>
+    </w:p>
+    <w:p>
+      <w:pPr>
+        <w:pStyle w:val="Lijstalinea"/>
+        <w:numPr>
+          <w:ilvl w:val="0"/>
+          <w:numId w:val="8"/>
+        </w:numPr>
+        <w:spacing w:after="0" w:line="240" w:lineRule="auto"/>
+        <w:contextualSpacing w:val="0"/>
+      </w:pPr>
+      <w:r>
+        <w:rPr>
+          <w:rFonts w:eastAsia="Times New Roman"/>
+        </w:rPr>
+        <w:t>Indien je geen extra gebiedsniveaus opneemt in je rapport: Zijn er geen overbodige gebiedsniveaus?  Basis: gemeente of provincie; vergelijking: provincie of gewest. S</w:t>
+      </w:r>
+      <w:r>
+        <w:rPr>
+          <w:rFonts w:eastAsia="Times New Roman"/>
+        </w:rPr>
+        <w:t xml:space="preserve">tandaard </w:t>
+      </w:r>
+      <w:r>
+        <w:rPr>
+          <w:rFonts w:eastAsia="Times New Roman"/>
+        </w:rPr>
+        <w:t xml:space="preserve">vergelijken we dus niet </w:t>
+      </w:r>
+      <w:r>
+        <w:rPr>
+          <w:rFonts w:eastAsia="Times New Roman"/>
+        </w:rPr>
+        <w:t xml:space="preserve">met een andere gemeente of </w:t>
+      </w:r>
+      <w:r>
+        <w:rPr>
+          <w:rFonts w:eastAsia="Times New Roman"/>
+        </w:rPr>
+        <w:t xml:space="preserve">stellen we </w:t>
+      </w:r>
+      <w:r>
+        <w:rPr>
+          <w:rFonts w:eastAsia="Times New Roman"/>
+        </w:rPr>
+        <w:t xml:space="preserve">‘Mijn regio’ </w:t>
+      </w:r>
+      <w:r>
+        <w:rPr>
+          <w:rFonts w:eastAsia="Times New Roman"/>
+        </w:rPr>
+        <w:t xml:space="preserve">niet </w:t>
+      </w:r>
+      <w:r>
+        <w:rPr>
+          <w:rFonts w:eastAsia="Times New Roman"/>
+        </w:rPr>
+        <w:t>beschikbaar</w:t>
+      </w:r>
+      <w:r>
+        <w:rPr>
+          <w:rFonts w:eastAsia="Times New Roman"/>
+        </w:rPr>
         <w:t>.</w:t>
       </w:r>
     </w:p>
@@ -2280,7 +2085,14 @@
         </w:numPr>
       </w:pPr>
       <w:r>
-        <w:t>(Wanneer je rapport wordt omgezet of een update krijgt): Staan er zaken in het rapport die beter geschrapt zouden worden?</w:t>
+        <w:lastRenderedPageBreak/>
+        <w:t xml:space="preserve">Vraag het rapport op </w:t>
+      </w:r>
+      <w:r>
+        <w:t>voor</w:t>
+      </w:r>
+      <w:r>
+        <w:t xml:space="preserve"> alle mogelijke niveaus en bekijk of het blijft werken. In het geval van het Vlaams gewest dien je ook na te gaan of er overal ‘het’ voor ‘Vlaams gewest’ geprogrammeerd werd.</w:t>
       </w:r>
     </w:p>
     <w:p>
@@ -2292,13 +2104,7 @@
         </w:numPr>
       </w:pPr>
       <w:r>
-        <w:t xml:space="preserve">Vraag het rapport op </w:t>
-      </w:r>
-      <w:r>
-        <w:t>voor</w:t>
-      </w:r>
-      <w:r>
-        <w:t xml:space="preserve"> alle mogelijke niveaus en bekijk of het blijft werken. In het geval van het Vlaams gewest dien je ook na te gaan of er overal ‘het’ voor ‘Vlaams gewest’ geprogrammeerd werd.</w:t>
+        <w:t xml:space="preserve">Vraag het rapport op voor twee verschillende gebieden en controleer of alle figuren verschillende cijfers geven voor elk gebied. </w:t>
       </w:r>
     </w:p>
     <w:p>
@@ -2310,7 +2116,7 @@
         </w:numPr>
       </w:pPr>
       <w:r>
-        <w:t xml:space="preserve">Vraag het rapport op voor twee verschillende gebieden en controleer of alle figuren verschillende cijfers geven voor elk gebied. </w:t>
+        <w:t>Bekijk of het rapport nog werkt wanneer je het opvraagt voor een zelfgemaakte regio.</w:t>
       </w:r>
     </w:p>
     <w:p>
@@ -2322,7 +2128,7 @@
         </w:numPr>
       </w:pPr>
       <w:r>
-        <w:t>Bekijk of het rapport nog werkt wanneer je het opvraagt voor een zelfgemaakte regio.</w:t>
+        <w:t>Is het rapport opvraagbaar voor Brussel? Is dit niet het geval, dan moet je rapport vervallen wanneer een gebruiker zowel een Brusselse gemeente opvraagt als het Brussels Hoofdstedelijk Gewest.</w:t>
       </w:r>
     </w:p>
     <w:p>
@@ -2334,8 +2140,7 @@
         </w:numPr>
       </w:pPr>
       <w:r>
-        <w:lastRenderedPageBreak/>
-        <w:t>Is het rapport opvraagbaar voor Brussel? Is dit niet het geval, dan moet je rapport vervallen wanneer een gebruiker zowel een Brusselse gemeente opvraagt als het Brussels Hoofdstedelijk Gewest.</w:t>
+        <w:t xml:space="preserve">Ga na tot hoeveel gebieden in Mijn regio het rapport nog behoorlijk werkt. Laat eventueel het rapport vervallen bij meer dan x gebieden in Mijn regio. </w:t>
       </w:r>
     </w:p>
     <w:p>
@@ -2347,7 +2152,7 @@
         </w:numPr>
       </w:pPr>
       <w:r>
-        <w:t xml:space="preserve">Ga na tot hoeveel gebieden in Mijn regio het rapport nog behoorlijk werkt. Laat eventueel het rapport vervallen bij meer dan x gebieden in Mijn regio. </w:t>
+        <w:t>Vergelijk de cijfers met deze in de databank en ga na of deze overeenkomen.</w:t>
       </w:r>
     </w:p>
     <w:p>
@@ -2359,7 +2164,7 @@
         </w:numPr>
       </w:pPr>
       <w:r>
-        <w:t>Vergelijk de cijfers met deze in de databank en ga na of deze overeenkomen.</w:t>
+        <w:t>Komen de cijfers en conclusies in de tekst overeen met wat er in de figuren getoond wordt?</w:t>
       </w:r>
     </w:p>
     <w:p>
@@ -2371,7 +2176,7 @@
         </w:numPr>
       </w:pPr>
       <w:r>
-        <w:t>Komen de cijfers en conclusies in de tekst overeen met wat er in de figuren getoond wordt?</w:t>
+        <w:t>Staat er overal een jaartal, bron en gebied vermeld?</w:t>
       </w:r>
     </w:p>
     <w:p>
@@ -2383,27 +2188,7 @@
         </w:numPr>
       </w:pPr>
       <w:r>
-        <w:t>Staat er overal een jaartal, bron en gebied vermeld?</w:t>
-      </w:r>
-    </w:p>
-    <w:p>
-      <w:pPr>
-        <w:pStyle w:val="Lijstalinea"/>
-        <w:numPr>
-          <w:ilvl w:val="0"/>
-          <w:numId w:val="8"/>
-        </w:numPr>
-      </w:pPr>
-      <w:r>
-        <w:t xml:space="preserve">Werken alle (externe) links? Controleer zeker de links naar bestaande rapporten, mogelijks werd er in de tussentijd een rapport omgezet naar </w:t>
-      </w:r>
-      <w:proofErr w:type="spellStart"/>
-      <w:r>
-        <w:t>stories</w:t>
-      </w:r>
-      <w:proofErr w:type="spellEnd"/>
-      <w:r>
-        <w:t>.</w:t>
+        <w:t>Werken alle (externe) links? Controleer zeker de links naar bestaande rapporten, mogelijks werd er in de tussentijd een rapport omgezet naar stories.</w:t>
       </w:r>
       <w:r>
         <w:t xml:space="preserve"> </w:t>
@@ -2420,23 +2205,7 @@
         </w:r>
       </w:hyperlink>
       <w:r>
-        <w:t xml:space="preserve"> kan terugvinden. Met dit script krijg je (1) een overzicht van alle links die in </w:t>
-      </w:r>
-      <w:proofErr w:type="spellStart"/>
-      <w:r>
-        <w:t>Stories</w:t>
-      </w:r>
-      <w:proofErr w:type="spellEnd"/>
-      <w:r>
-        <w:t xml:space="preserve">-rapporten gebruikt worden, (2) een overzicht van alle viewer-presentaties in </w:t>
-      </w:r>
-      <w:proofErr w:type="spellStart"/>
-      <w:r>
-        <w:t>Stories</w:t>
-      </w:r>
-      <w:proofErr w:type="spellEnd"/>
-      <w:r>
-        <w:t>-rapporten en (3) links die niet (meer) werken.</w:t>
+        <w:t xml:space="preserve"> kan terugvinden. Met dit script krijg je (1) een overzicht van alle links die in Stories-rapporten gebruikt worden, (2) een overzicht van alle viewer-presentaties in Stories-rapporten en (3) links die niet (meer) werken.</w:t>
       </w:r>
     </w:p>
     <w:p>
@@ -2496,15 +2265,7 @@
         </w:numPr>
       </w:pPr>
       <w:r>
-        <w:t>Controleer het rapport als je niet ingelogd bent (pas dan in de URL ‘</w:t>
-      </w:r>
-      <w:proofErr w:type="spellStart"/>
-      <w:r>
-        <w:t>admin</w:t>
-      </w:r>
-      <w:proofErr w:type="spellEnd"/>
-      <w:r>
-        <w:t xml:space="preserve">/jive’ aan naar ‘databank’). Let wel: je hebt dan waarschijnlijk niet de laatste versie van het rapport maar de versie vlak na publicatie op vrijdagavond. </w:t>
+        <w:t xml:space="preserve">Controleer het rapport als je niet ingelogd bent (pas dan in de URL ‘admin/jive’ aan naar ‘databank’). Let wel: je hebt dan waarschijnlijk niet de laatste versie van het rapport maar de versie vlak na publicatie op vrijdagavond. </w:t>
       </w:r>
     </w:p>
     <w:p>
@@ -2600,6 +2361,35 @@
     </w:p>
     <w:p>
       <w:pPr>
+        <w:pStyle w:val="Lijstalinea"/>
+        <w:numPr>
+          <w:ilvl w:val="0"/>
+          <w:numId w:val="1"/>
+        </w:numPr>
+        <w:spacing w:after="0" w:line="240" w:lineRule="auto"/>
+        <w:contextualSpacing w:val="0"/>
+      </w:pPr>
+      <w:r>
+        <w:rPr>
+          <w:rFonts w:eastAsia="Times New Roman"/>
+        </w:rPr>
+        <w:t xml:space="preserve">Zijn er geen overbodige gebiedsniveaus? Basis: gemeente of provincie; vergelijking: provincie of gewest. Standaard vergelijken we dus niet met een andere gemeente of stellen we ‘Mijn regio’ </w:t>
+      </w:r>
+      <w:r>
+        <w:rPr>
+          <w:rFonts w:eastAsia="Times New Roman"/>
+        </w:rPr>
+        <w:t xml:space="preserve">niet </w:t>
+      </w:r>
+      <w:r>
+        <w:rPr>
+          <w:rFonts w:eastAsia="Times New Roman"/>
+        </w:rPr>
+        <w:t>beschikbaar.</w:t>
+      </w:r>
+    </w:p>
+    <w:p>
+      <w:pPr>
         <w:numPr>
           <w:ilvl w:val="0"/>
           <w:numId w:val="1"/>
@@ -2630,7 +2420,8 @@
         <w:ind w:left="714" w:hanging="357"/>
       </w:pPr>
       <w:r>
-        <w:t>Kijk de verschillende cijfers na en vergelijk met deze met de cijfers in de databank (check dat er niet per ongeluk een foutie</w:t>
+        <w:lastRenderedPageBreak/>
+        <w:t>Kijk de verschillende cijfers na en vergelijk deze met de cijfers in de databank (check dat er niet per ongeluk een foutie</w:t>
       </w:r>
       <w:r>
         <w:t>f onderwerp werd geselecteerd)</w:t>
@@ -2646,7 +2437,13 @@
         <w:ind w:left="714" w:hanging="357"/>
       </w:pPr>
       <w:r>
-        <w:t>Werken alle links naar rapporten, databank, metadata…?</w:t>
+        <w:t>Werken alle links naar rapporten, databank, metadata</w:t>
+      </w:r>
+      <w:r>
+        <w:t xml:space="preserve"> </w:t>
+      </w:r>
+      <w:r>
+        <w:t>…?</w:t>
       </w:r>
     </w:p>
     <w:p>
@@ -2664,6 +2461,163 @@
     </w:p>
     <w:p>
       <w:pPr>
+        <w:numPr>
+          <w:ilvl w:val="0"/>
+          <w:numId w:val="1"/>
+        </w:numPr>
+        <w:spacing w:after="120" w:line="240" w:lineRule="auto"/>
+      </w:pPr>
+      <w:r>
+        <w:t>Werd de beschrijving van de gebruikte indicatoren uitgebreid?</w:t>
+      </w:r>
+      <w:r>
+        <w:t xml:space="preserve"> (</w:t>
+      </w:r>
+      <w:r>
+        <w:t>RG 21/04/2026: Uitbreiding beschrijving</w:t>
+      </w:r>
+      <w:r>
+        <w:t xml:space="preserve">: </w:t>
+      </w:r>
+      <w:r>
+        <w:t>we breiden de beschrijving uit, te beginnen met de indicatoren die in dashboards en stories voorkomen. De beschrijving mag niet te lang zijn maar bij voorkeur ook niet gewoon de naam van de indicator, tenzij het heel duidelijk is.</w:t>
+      </w:r>
+      <w:r>
+        <w:t>)</w:t>
+      </w:r>
+    </w:p>
+    <w:p>
+      <w:pPr>
+        <w:numPr>
+          <w:ilvl w:val="0"/>
+          <w:numId w:val="1"/>
+        </w:numPr>
+        <w:spacing w:after="120" w:line="240" w:lineRule="auto"/>
+        <w:ind w:left="714" w:hanging="357"/>
+      </w:pPr>
+      <w:r>
+        <w:t xml:space="preserve">Kan je bovenaan doorklikken naar de databank </w:t>
+      </w:r>
+      <w:r>
+        <w:t xml:space="preserve">(klapt die open in het juiste thema?) </w:t>
+      </w:r>
+      <w:r>
+        <w:t>en eventueel een wijkdashboard?</w:t>
+      </w:r>
+    </w:p>
+    <w:p>
+      <w:pPr>
+        <w:numPr>
+          <w:ilvl w:val="0"/>
+          <w:numId w:val="1"/>
+        </w:numPr>
+        <w:spacing w:after="120" w:line="240" w:lineRule="auto"/>
+        <w:ind w:left="714" w:hanging="357"/>
+      </w:pPr>
+      <w:r>
+        <w:t xml:space="preserve">Kan je onderaan doorklikken naar de rapporten (als die er zijn), de databank </w:t>
+      </w:r>
+      <w:r>
+        <w:t xml:space="preserve">(klapt die open in het juiste thema?) </w:t>
+      </w:r>
+      <w:r>
+        <w:t>en de contactgegevens van provinciale medewerkers OF D&amp;A?</w:t>
+      </w:r>
+    </w:p>
+    <w:p>
+      <w:pPr>
+        <w:numPr>
+          <w:ilvl w:val="0"/>
+          <w:numId w:val="1"/>
+        </w:numPr>
+        <w:spacing w:after="120" w:line="240" w:lineRule="auto"/>
+        <w:ind w:left="714" w:hanging="357"/>
+      </w:pPr>
+      <w:r>
+        <w:t xml:space="preserve">Werd er Meer info in het uitklapvenster toegevoegd waar nodig? Sowieso vind je hier al de beschrijving van de indicatoren in terug. </w:t>
+      </w:r>
+    </w:p>
+    <w:p>
+      <w:pPr>
+        <w:numPr>
+          <w:ilvl w:val="0"/>
+          <w:numId w:val="1"/>
+        </w:numPr>
+        <w:spacing w:after="120" w:line="240" w:lineRule="auto"/>
+        <w:ind w:left="714" w:hanging="357"/>
+      </w:pPr>
+      <w:r>
+        <w:t>Klopt de titel van het dashboard: Kerncijfers x (thema)?</w:t>
+      </w:r>
+    </w:p>
+    <w:p>
+      <w:pPr>
+        <w:numPr>
+          <w:ilvl w:val="0"/>
+          <w:numId w:val="1"/>
+        </w:numPr>
+        <w:spacing w:after="120" w:line="240" w:lineRule="auto"/>
+        <w:ind w:left="714" w:hanging="357"/>
+      </w:pPr>
+      <w:r>
+        <w:t>Werd voor alle velden (titels, Meer informatie) de voorziene template gebruikt? </w:t>
+      </w:r>
+    </w:p>
+    <w:p>
+      <w:pPr>
+        <w:numPr>
+          <w:ilvl w:val="0"/>
+          <w:numId w:val="1"/>
+        </w:numPr>
+        <w:spacing w:after="120" w:line="240" w:lineRule="auto"/>
+        <w:ind w:left="714" w:hanging="357"/>
+      </w:pPr>
+      <w:r>
+        <w:t>Wordt er voldoende toelichting gegeven bij de indicatoren / grafieken / kaarten om ze als leek te kunnen interpreteren?</w:t>
+      </w:r>
+    </w:p>
+    <w:p>
+      <w:pPr>
+        <w:numPr>
+          <w:ilvl w:val="0"/>
+          <w:numId w:val="1"/>
+        </w:numPr>
+        <w:spacing w:after="120" w:line="240" w:lineRule="auto"/>
+        <w:ind w:left="714" w:hanging="357"/>
+      </w:pPr>
+      <w:r>
+        <w:t>Worden de regels gevolgd (cfr</w:t>
+      </w:r>
+      <w:r>
+        <w:t>.</w:t>
+      </w:r>
+      <w:r>
+        <w:t xml:space="preserve"> stories) voor (onder)titels van grafieken / kaarten (bijvoorbeeld '% t.o.v. ...')</w:t>
+      </w:r>
+      <w:r>
+        <w:t>?</w:t>
+      </w:r>
+    </w:p>
+    <w:p>
+      <w:pPr>
+        <w:numPr>
+          <w:ilvl w:val="0"/>
+          <w:numId w:val="1"/>
+        </w:numPr>
+        <w:spacing w:after="120" w:line="240" w:lineRule="auto"/>
+        <w:ind w:left="714" w:hanging="357"/>
+      </w:pPr>
+      <w:r>
+        <w:t>Wordt overal het juiste kleurenschema toegepast?</w:t>
+      </w:r>
+    </w:p>
+    <w:p>
+      <w:pPr>
+        <w:spacing w:after="120" w:line="240" w:lineRule="auto"/>
+      </w:pPr>
+    </w:p>
+    <w:p>
+      <w:pPr>
         <w:spacing w:after="120" w:line="240" w:lineRule="auto"/>
       </w:pPr>
     </w:p>
@@ -2672,7 +2626,6 @@
         <w:pStyle w:val="Kop2"/>
       </w:pPr>
       <w:r>
-        <w:lastRenderedPageBreak/>
         <w:t>Projectfiches</w:t>
       </w:r>
     </w:p>
@@ -2686,15 +2639,7 @@
         <w:ind w:left="714" w:hanging="357"/>
       </w:pPr>
       <w:r>
-        <w:t xml:space="preserve"> Zijn de contactgegevens up </w:t>
-      </w:r>
-      <w:proofErr w:type="spellStart"/>
-      <w:r>
-        <w:t>to</w:t>
-      </w:r>
-      <w:proofErr w:type="spellEnd"/>
-      <w:r>
-        <w:t xml:space="preserve"> date? </w:t>
+        <w:t xml:space="preserve"> Zijn de contactgegevens up to date? </w:t>
       </w:r>
     </w:p>
     <w:p>
@@ -2843,15 +2788,7 @@
         <w:footnoteRef/>
       </w:r>
       <w:r>
-        <w:t xml:space="preserve"> Hiermee wordt NIET verwezen naar het vakje ‘</w:t>
-      </w:r>
-      <w:proofErr w:type="spellStart"/>
-      <w:r>
-        <w:t>visible</w:t>
-      </w:r>
-      <w:proofErr w:type="spellEnd"/>
-      <w:r>
-        <w:t>’ in de indicatorenlijst van studio maar naar die van het thema in de CategoryTree</w:t>
+        <w:t xml:space="preserve"> Hiermee wordt NIET verwezen naar het vakje ‘visible’ in de indicatorenlijst van studio maar naar die van het thema in de CategoryTree</w:t>
       </w:r>
       <w:r>
         <w:br/>
@@ -2895,6 +2832,92 @@
 <file path=word/numbering.xml><?xml version="1.0" encoding="utf-8"?>
 <w:numbering xmlns:wpc="http://schemas.microsoft.com/office/word/2010/wordprocessingCanvas" xmlns:cx="http://schemas.microsoft.com/office/drawing/2014/chartex" xmlns:cx1="http://schemas.microsoft.com/office/drawing/2015/9/8/chartex" xmlns:cx2="http://schemas.microsoft.com/office/drawing/2015/10/21/chartex" xmlns:cx3="http://schemas.microsoft.com/office/drawing/2016/5/9/chartex" xmlns:cx4="http://schemas.microsoft.com/office/drawing/2016/5/10/chartex" xmlns:cx5="http://schemas.microsoft.com/office/drawing/2016/5/11/chartex" xmlns:cx6="http://schemas.microsoft.com/office/drawing/2016/5/12/chartex" xmlns:cx7="http://schemas.microsoft.com/office/drawing/2016/5/13/chartex" xmlns:cx8="http://schemas.microsoft.com/office/drawing/2016/5/14/chartex" xmlns:mc="http://schemas.openxmlformats.org/markup-compatibility/2006" xmlns:aink="http://schemas.microsoft.com/office/drawing/2016/ink" xmlns:am3d="http://schemas.microsoft.com/office/drawing/2017/model3d" xmlns:o="urn:schemas-microsoft-com:office:office" xmlns:oel="http://schemas.microsoft.com/office/2019/extlst" xmlns:r="http://schemas.openxmlformats.org/officeDocument/2006/relationships" xmlns:m="http://schemas.openxmlformats.org/officeDocument/2006/math" xmlns:v="urn:schemas-microsoft-com:vml" xmlns:wp14="http://schemas.microsoft.com/office/word/2010/wordprocessingDrawing" xmlns:wp="http://schemas.openxmlformats.org/drawingml/2006/wordprocessingDrawing" xmlns:w10="urn:schemas-microsoft-com:office:word" xmlns:w="http://schemas.openxmlformats.org/wordprocessingml/2006/main" xmlns:w14="http://schemas.microsoft.com/office/word/2010/wordml" xmlns:w15="http://schemas.microsoft.com/office/word/2012/wordml" xmlns:w16cex="http://schemas.microsoft.com/office/word/2018/wordml/cex" xmlns:w16cid="http://schemas.microsoft.com/office/word/2016/wordml/cid" xmlns:w16="http://schemas.microsoft.com/office/word/2018/wordml" xmlns:w16du="http://schemas.microsoft.com/office/word/2023/wordml/word16du" xmlns:w16sdtdh="http://schemas.microsoft.com/office/word/2020/wordml/sdtdatahash" xmlns:w16sdtfl="http://schemas.microsoft.com/office/word/2024/wordml/sdtformatlock" xmlns:w16se="http://schemas.microsoft.com/office/word/2015/wordml/symex" xmlns:wpg="http://schemas.microsoft.com/office/word/2010/wordprocessingGroup" xmlns:wpi="http://schemas.microsoft.com/office/word/2010/wordprocessingInk" xmlns:wne="http://schemas.microsoft.com/office/word/2006/wordml" xmlns:wps="http://schemas.microsoft.com/office/word/2010/wordprocessingShape" mc:Ignorable="w14 w15 w16se w16cid w16 w16cex w16sdtdh w16sdtfl w16du wp14">
   <w:abstractNum w:abstractNumId="0" w15:restartNumberingAfterBreak="0">
+    <w:nsid w:val="082E0F04"/>
+    <w:multiLevelType w:val="hybridMultilevel"/>
+    <w:tmpl w:val="9ECA45FA"/>
+    <w:lvl w:ilvl="0" w:tplc="0813000F">
+      <w:start w:val="1"/>
+      <w:numFmt w:val="decimal"/>
+      <w:lvlText w:val="%1."/>
+      <w:lvlJc w:val="left"/>
+      <w:pPr>
+        <w:ind w:left="720" w:hanging="360"/>
+      </w:pPr>
+    </w:lvl>
+    <w:lvl w:ilvl="1" w:tplc="08130019">
+      <w:start w:val="1"/>
+      <w:numFmt w:val="lowerLetter"/>
+      <w:lvlText w:val="%2."/>
+      <w:lvlJc w:val="left"/>
+      <w:pPr>
+        <w:ind w:left="1440" w:hanging="360"/>
+      </w:pPr>
+    </w:lvl>
+    <w:lvl w:ilvl="2" w:tplc="0813001B">
+      <w:start w:val="1"/>
+      <w:numFmt w:val="lowerRoman"/>
+      <w:lvlText w:val="%3."/>
+      <w:lvlJc w:val="right"/>
+      <w:pPr>
+        <w:ind w:left="2160" w:hanging="180"/>
+      </w:pPr>
+    </w:lvl>
+    <w:lvl w:ilvl="3" w:tplc="0813000F">
+      <w:start w:val="1"/>
+      <w:numFmt w:val="decimal"/>
+      <w:lvlText w:val="%4."/>
+      <w:lvlJc w:val="left"/>
+      <w:pPr>
+        <w:ind w:left="2880" w:hanging="360"/>
+      </w:pPr>
+    </w:lvl>
+    <w:lvl w:ilvl="4" w:tplc="08130019">
+      <w:start w:val="1"/>
+      <w:numFmt w:val="lowerLetter"/>
+      <w:lvlText w:val="%5."/>
+      <w:lvlJc w:val="left"/>
+      <w:pPr>
+        <w:ind w:left="3600" w:hanging="360"/>
+      </w:pPr>
+    </w:lvl>
+    <w:lvl w:ilvl="5" w:tplc="0813001B">
+      <w:start w:val="1"/>
+      <w:numFmt w:val="lowerRoman"/>
+      <w:lvlText w:val="%6."/>
+      <w:lvlJc w:val="right"/>
+      <w:pPr>
+        <w:ind w:left="4320" w:hanging="180"/>
+      </w:pPr>
+    </w:lvl>
+    <w:lvl w:ilvl="6" w:tplc="0813000F">
+      <w:start w:val="1"/>
+      <w:numFmt w:val="decimal"/>
+      <w:lvlText w:val="%7."/>
+      <w:lvlJc w:val="left"/>
+      <w:pPr>
+        <w:ind w:left="5040" w:hanging="360"/>
+      </w:pPr>
+    </w:lvl>
+    <w:lvl w:ilvl="7" w:tplc="08130019">
+      <w:start w:val="1"/>
+      <w:numFmt w:val="lowerLetter"/>
+      <w:lvlText w:val="%8."/>
+      <w:lvlJc w:val="left"/>
+      <w:pPr>
+        <w:ind w:left="5760" w:hanging="360"/>
+      </w:pPr>
+    </w:lvl>
+    <w:lvl w:ilvl="8" w:tplc="0813001B">
+      <w:start w:val="1"/>
+      <w:numFmt w:val="lowerRoman"/>
+      <w:lvlText w:val="%9."/>
+      <w:lvlJc w:val="right"/>
+      <w:pPr>
+        <w:ind w:left="6480" w:hanging="180"/>
+      </w:pPr>
+    </w:lvl>
+  </w:abstractNum>
+  <w:abstractNum w:abstractNumId="1" w15:restartNumberingAfterBreak="0">
     <w:nsid w:val="287E2E01"/>
     <w:multiLevelType w:val="hybridMultilevel"/>
     <w:tmpl w:val="A2341FA8"/>
@@ -3007,7 +3030,156 @@
       </w:rPr>
     </w:lvl>
   </w:abstractNum>
-  <w:abstractNum w:abstractNumId="1" w15:restartNumberingAfterBreak="0">
+  <w:abstractNum w:abstractNumId="2" w15:restartNumberingAfterBreak="0">
+    <w:nsid w:val="299B6B2B"/>
+    <w:multiLevelType w:val="multilevel"/>
+    <w:tmpl w:val="1C94DC1C"/>
+    <w:lvl w:ilvl="0">
+      <w:start w:val="1"/>
+      <w:numFmt w:val="bullet"/>
+      <w:lvlText w:val=""/>
+      <w:lvlJc w:val="left"/>
+      <w:pPr>
+        <w:tabs>
+          <w:tab w:val="num" w:pos="720"/>
+        </w:tabs>
+        <w:ind w:left="720" w:hanging="360"/>
+      </w:pPr>
+      <w:rPr>
+        <w:rFonts w:ascii="Symbol" w:hAnsi="Symbol" w:hint="default"/>
+        <w:sz w:val="20"/>
+      </w:rPr>
+    </w:lvl>
+    <w:lvl w:ilvl="1">
+      <w:start w:val="1"/>
+      <w:numFmt w:val="bullet"/>
+      <w:lvlText w:val=""/>
+      <w:lvlJc w:val="left"/>
+      <w:pPr>
+        <w:tabs>
+          <w:tab w:val="num" w:pos="1440"/>
+        </w:tabs>
+        <w:ind w:left="1440" w:hanging="360"/>
+      </w:pPr>
+      <w:rPr>
+        <w:rFonts w:ascii="Symbol" w:hAnsi="Symbol" w:hint="default"/>
+        <w:sz w:val="20"/>
+      </w:rPr>
+    </w:lvl>
+    <w:lvl w:ilvl="2">
+      <w:start w:val="1"/>
+      <w:numFmt w:val="bullet"/>
+      <w:lvlText w:val=""/>
+      <w:lvlJc w:val="left"/>
+      <w:pPr>
+        <w:tabs>
+          <w:tab w:val="num" w:pos="2160"/>
+        </w:tabs>
+        <w:ind w:left="2160" w:hanging="360"/>
+      </w:pPr>
+      <w:rPr>
+        <w:rFonts w:ascii="Symbol" w:hAnsi="Symbol" w:hint="default"/>
+        <w:sz w:val="20"/>
+      </w:rPr>
+    </w:lvl>
+    <w:lvl w:ilvl="3">
+      <w:start w:val="1"/>
+      <w:numFmt w:val="bullet"/>
+      <w:lvlText w:val=""/>
+      <w:lvlJc w:val="left"/>
+      <w:pPr>
+        <w:tabs>
+          <w:tab w:val="num" w:pos="2880"/>
+        </w:tabs>
+        <w:ind w:left="2880" w:hanging="360"/>
+      </w:pPr>
+      <w:rPr>
+        <w:rFonts w:ascii="Symbol" w:hAnsi="Symbol" w:hint="default"/>
+        <w:sz w:val="20"/>
+      </w:rPr>
+    </w:lvl>
+    <w:lvl w:ilvl="4">
+      <w:start w:val="1"/>
+      <w:numFmt w:val="bullet"/>
+      <w:lvlText w:val=""/>
+      <w:lvlJc w:val="left"/>
+      <w:pPr>
+        <w:tabs>
+          <w:tab w:val="num" w:pos="3600"/>
+        </w:tabs>
+        <w:ind w:left="3600" w:hanging="360"/>
+      </w:pPr>
+      <w:rPr>
+        <w:rFonts w:ascii="Symbol" w:hAnsi="Symbol" w:hint="default"/>
+        <w:sz w:val="20"/>
+      </w:rPr>
+    </w:lvl>
+    <w:lvl w:ilvl="5">
+      <w:start w:val="1"/>
+      <w:numFmt w:val="bullet"/>
+      <w:lvlText w:val=""/>
+      <w:lvlJc w:val="left"/>
+      <w:pPr>
+        <w:tabs>
+          <w:tab w:val="num" w:pos="4320"/>
+        </w:tabs>
+        <w:ind w:left="4320" w:hanging="360"/>
+      </w:pPr>
+      <w:rPr>
+        <w:rFonts w:ascii="Symbol" w:hAnsi="Symbol" w:hint="default"/>
+        <w:sz w:val="20"/>
+      </w:rPr>
+    </w:lvl>
+    <w:lvl w:ilvl="6">
+      <w:start w:val="1"/>
+      <w:numFmt w:val="bullet"/>
+      <w:lvlText w:val=""/>
+      <w:lvlJc w:val="left"/>
+      <w:pPr>
+        <w:tabs>
+          <w:tab w:val="num" w:pos="5040"/>
+        </w:tabs>
+        <w:ind w:left="5040" w:hanging="360"/>
+      </w:pPr>
+      <w:rPr>
+        <w:rFonts w:ascii="Symbol" w:hAnsi="Symbol" w:hint="default"/>
+        <w:sz w:val="20"/>
+      </w:rPr>
+    </w:lvl>
+    <w:lvl w:ilvl="7">
+      <w:start w:val="1"/>
+      <w:numFmt w:val="bullet"/>
+      <w:lvlText w:val=""/>
+      <w:lvlJc w:val="left"/>
+      <w:pPr>
+        <w:tabs>
+          <w:tab w:val="num" w:pos="5760"/>
+        </w:tabs>
+        <w:ind w:left="5760" w:hanging="360"/>
+      </w:pPr>
+      <w:rPr>
+        <w:rFonts w:ascii="Symbol" w:hAnsi="Symbol" w:hint="default"/>
+        <w:sz w:val="20"/>
+      </w:rPr>
+    </w:lvl>
+    <w:lvl w:ilvl="8">
+      <w:start w:val="1"/>
+      <w:numFmt w:val="bullet"/>
+      <w:lvlText w:val=""/>
+      <w:lvlJc w:val="left"/>
+      <w:pPr>
+        <w:tabs>
+          <w:tab w:val="num" w:pos="6480"/>
+        </w:tabs>
+        <w:ind w:left="6480" w:hanging="360"/>
+      </w:pPr>
+      <w:rPr>
+        <w:rFonts w:ascii="Symbol" w:hAnsi="Symbol" w:hint="default"/>
+        <w:sz w:val="20"/>
+      </w:rPr>
+    </w:lvl>
+  </w:abstractNum>
+  <w:abstractNum w:abstractNumId="3" w15:restartNumberingAfterBreak="0">
     <w:nsid w:val="2C155000"/>
     <w:multiLevelType w:val="hybridMultilevel"/>
     <w:tmpl w:val="42D44A36"/>
@@ -3120,7 +3292,7 @@
       </w:rPr>
     </w:lvl>
   </w:abstractNum>
-  <w:abstractNum w:abstractNumId="2" w15:restartNumberingAfterBreak="0">
+  <w:abstractNum w:abstractNumId="4" w15:restartNumberingAfterBreak="0">
     <w:nsid w:val="2FB3336E"/>
     <w:multiLevelType w:val="multilevel"/>
     <w:tmpl w:val="66F64CFC"/>
@@ -3269,7 +3441,7 @@
       </w:rPr>
     </w:lvl>
   </w:abstractNum>
-  <w:abstractNum w:abstractNumId="3" w15:restartNumberingAfterBreak="0">
+  <w:abstractNum w:abstractNumId="5" w15:restartNumberingAfterBreak="0">
     <w:nsid w:val="3D38462C"/>
     <w:multiLevelType w:val="hybridMultilevel"/>
     <w:tmpl w:val="559483BC"/>
@@ -3381,7 +3553,7 @@
       </w:rPr>
     </w:lvl>
   </w:abstractNum>
-  <w:abstractNum w:abstractNumId="4" w15:restartNumberingAfterBreak="0">
+  <w:abstractNum w:abstractNumId="6" w15:restartNumberingAfterBreak="0">
     <w:nsid w:val="45B3258B"/>
     <w:multiLevelType w:val="hybridMultilevel"/>
     <w:tmpl w:val="775451D4"/>
@@ -3494,7 +3666,7 @@
       </w:rPr>
     </w:lvl>
   </w:abstractNum>
-  <w:abstractNum w:abstractNumId="5" w15:restartNumberingAfterBreak="0">
+  <w:abstractNum w:abstractNumId="7" w15:restartNumberingAfterBreak="0">
     <w:nsid w:val="47721ABB"/>
     <w:multiLevelType w:val="hybridMultilevel"/>
     <w:tmpl w:val="BCFA647C"/>
@@ -3607,7 +3779,7 @@
       </w:rPr>
     </w:lvl>
   </w:abstractNum>
-  <w:abstractNum w:abstractNumId="6" w15:restartNumberingAfterBreak="0">
+  <w:abstractNum w:abstractNumId="8" w15:restartNumberingAfterBreak="0">
     <w:nsid w:val="59205852"/>
     <w:multiLevelType w:val="hybridMultilevel"/>
     <w:tmpl w:val="4B403568"/>
@@ -3720,7 +3892,7 @@
       </w:rPr>
     </w:lvl>
   </w:abstractNum>
-  <w:abstractNum w:abstractNumId="7" w15:restartNumberingAfterBreak="0">
+  <w:abstractNum w:abstractNumId="9" w15:restartNumberingAfterBreak="0">
     <w:nsid w:val="599A3ADC"/>
     <w:multiLevelType w:val="hybridMultilevel"/>
     <w:tmpl w:val="4D925346"/>
@@ -3833,7 +4005,7 @@
       </w:rPr>
     </w:lvl>
   </w:abstractNum>
-  <w:abstractNum w:abstractNumId="8" w15:restartNumberingAfterBreak="0">
+  <w:abstractNum w:abstractNumId="10" w15:restartNumberingAfterBreak="0">
     <w:nsid w:val="5FA92E56"/>
     <w:multiLevelType w:val="hybridMultilevel"/>
     <w:tmpl w:val="BC129724"/>
@@ -3947,31 +4119,73 @@
     </w:lvl>
   </w:abstractNum>
   <w:num w:numId="1" w16cid:durableId="555942580">
-    <w:abstractNumId w:val="0"/>
+    <w:abstractNumId w:val="1"/>
   </w:num>
   <w:num w:numId="2" w16cid:durableId="1579242795">
-    <w:abstractNumId w:val="2"/>
+    <w:abstractNumId w:val="4"/>
   </w:num>
   <w:num w:numId="3" w16cid:durableId="459417532">
+    <w:abstractNumId w:val="9"/>
+  </w:num>
+  <w:num w:numId="4" w16cid:durableId="406538838">
     <w:abstractNumId w:val="7"/>
   </w:num>
-  <w:num w:numId="4" w16cid:durableId="406538838">
+  <w:num w:numId="5" w16cid:durableId="1858539726">
+    <w:abstractNumId w:val="3"/>
+  </w:num>
+  <w:num w:numId="6" w16cid:durableId="1709531238">
+    <w:abstractNumId w:val="10"/>
+  </w:num>
+  <w:num w:numId="7" w16cid:durableId="1063485252">
+    <w:abstractNumId w:val="6"/>
+  </w:num>
+  <w:num w:numId="8" w16cid:durableId="729501446">
+    <w:abstractNumId w:val="8"/>
+  </w:num>
+  <w:num w:numId="9" w16cid:durableId="719748276">
     <w:abstractNumId w:val="5"/>
   </w:num>
-  <w:num w:numId="5" w16cid:durableId="1858539726">
-    <w:abstractNumId w:val="1"/>
+  <w:num w:numId="10" w16cid:durableId="2052265901">
+    <w:abstractNumId w:val="2"/>
+    <w:lvlOverride w:ilvl="0"/>
+    <w:lvlOverride w:ilvl="1"/>
+    <w:lvlOverride w:ilvl="2"/>
+    <w:lvlOverride w:ilvl="3"/>
+    <w:lvlOverride w:ilvl="4"/>
+    <w:lvlOverride w:ilvl="5"/>
+    <w:lvlOverride w:ilvl="6"/>
+    <w:lvlOverride w:ilvl="7"/>
+    <w:lvlOverride w:ilvl="8"/>
   </w:num>
-  <w:num w:numId="6" w16cid:durableId="1709531238">
-    <w:abstractNumId w:val="8"/>
-  </w:num>
-  <w:num w:numId="7" w16cid:durableId="1063485252">
-    <w:abstractNumId w:val="4"/>
-  </w:num>
-  <w:num w:numId="8" w16cid:durableId="729501446">
-    <w:abstractNumId w:val="6"/>
-  </w:num>
-  <w:num w:numId="9" w16cid:durableId="719748276">
-    <w:abstractNumId w:val="3"/>
+  <w:num w:numId="11" w16cid:durableId="1904098176">
+    <w:abstractNumId w:val="0"/>
+    <w:lvlOverride w:ilvl="0">
+      <w:startOverride w:val="1"/>
+    </w:lvlOverride>
+    <w:lvlOverride w:ilvl="1">
+      <w:startOverride w:val="1"/>
+    </w:lvlOverride>
+    <w:lvlOverride w:ilvl="2">
+      <w:startOverride w:val="1"/>
+    </w:lvlOverride>
+    <w:lvlOverride w:ilvl="3">
+      <w:startOverride w:val="1"/>
+    </w:lvlOverride>
+    <w:lvlOverride w:ilvl="4">
+      <w:startOverride w:val="1"/>
+    </w:lvlOverride>
+    <w:lvlOverride w:ilvl="5">
+      <w:startOverride w:val="1"/>
+    </w:lvlOverride>
+    <w:lvlOverride w:ilvl="6">
+      <w:startOverride w:val="1"/>
+    </w:lvlOverride>
+    <w:lvlOverride w:ilvl="7">
+      <w:startOverride w:val="1"/>
+    </w:lvlOverride>
+    <w:lvlOverride w:ilvl="8">
+      <w:startOverride w:val="1"/>
+    </w:lvlOverride>
   </w:num>
 </w:numbering>
 </file>

</xml_diff>